<commit_message>
add some more test cases and added to the report
</commit_message>
<xml_diff>
--- a/test_cases/TEST_FINDINGS_REPORT.docx
+++ b/test_cases/TEST_FINDINGS_REPORT.docx
@@ -4,31 +4,22 @@
   <w:body>
     <w:p>
       <w:pPr>
+        <w:pStyle w:val="Title"/>
         <w:jc w:val="center"/>
       </w:pPr>
       <w:r>
-        <w:rPr>
-          <w:b/>
-          <w:color w:val="FF6B6B"/>
-          <w:sz w:val="52"/>
-        </w:rPr>
-        <w:t>🍽️  TENDER FIREBASE APP</w:t>
+        <w:t>Tender Firebase App — Story 2</w:t>
       </w:r>
     </w:p>
     <w:p>
       <w:pPr>
+        <w:pStyle w:val="Heading1"/>
         <w:jc w:val="center"/>
       </w:pPr>
       <w:r>
-        <w:rPr>
-          <w:b/>
-          <w:color w:val="2C3E50"/>
-          <w:sz w:val="32"/>
-        </w:rPr>
-        <w:t>Story 2 Test Suite — Initial Findings &amp; Process Report</w:t>
+        <w:t>Findings, Fixes &amp; Process Report</w:t>
       </w:r>
     </w:p>
-    <w:p/>
     <w:tbl>
       <w:tblPr>
         <w:tblStyle w:val="TableGrid"/>
@@ -36,20 +27,18 @@
         <w:tblLook w:firstColumn="1" w:firstRow="1" w:lastColumn="0" w:lastRow="0" w:noHBand="0" w:noVBand="1" w:val="04A0"/>
       </w:tblPr>
       <w:tblGrid>
-        <w:gridCol w:w="4703"/>
-        <w:gridCol w:w="4703"/>
+        <w:gridCol w:w="4320"/>
+        <w:gridCol w:w="4320"/>
       </w:tblGrid>
       <w:tr>
         <w:tc>
           <w:tcPr>
-            <w:tcW w:type="dxa" w:w="4703"/>
-            <w:shd w:val="clear" w:color="auto" w:fill="FF6B6B"/>
+            <w:tcW w:type="dxa" w:w="4320"/>
           </w:tcPr>
           <w:p>
             <w:r>
               <w:rPr>
                 <w:b/>
-                <w:color w:val="FFFFFF"/>
               </w:rPr>
               <w:t>Course</w:t>
             </w:r>
@@ -57,7 +46,7 @@
         </w:tc>
         <w:tc>
           <w:tcPr>
-            <w:tcW w:type="dxa" w:w="4703"/>
+            <w:tcW w:type="dxa" w:w="4320"/>
           </w:tcPr>
           <w:p>
             <w:r>
@@ -69,41 +58,12 @@
       <w:tr>
         <w:tc>
           <w:tcPr>
-            <w:tcW w:type="dxa" w:w="4703"/>
-            <w:shd w:val="clear" w:color="auto" w:fill="FF6B6B"/>
+            <w:tcW w:type="dxa" w:w="4320"/>
           </w:tcPr>
           <w:p>
             <w:r>
               <w:rPr>
                 <w:b/>
-                <w:color w:val="FFFFFF"/>
-              </w:rPr>
-              <w:t>Iteration</w:t>
-            </w:r>
-          </w:p>
-        </w:tc>
-        <w:tc>
-          <w:tcPr>
-            <w:tcW w:type="dxa" w:w="4703"/>
-          </w:tcPr>
-          <w:p>
-            <w:r>
-              <w:t>1st Iteration Acceptance Testing</w:t>
-            </w:r>
-          </w:p>
-        </w:tc>
-      </w:tr>
-      <w:tr>
-        <w:tc>
-          <w:tcPr>
-            <w:tcW w:type="dxa" w:w="4703"/>
-            <w:shd w:val="clear" w:color="auto" w:fill="FF6B6B"/>
-          </w:tcPr>
-          <w:p>
-            <w:r>
-              <w:rPr>
-                <w:b/>
-                <w:color w:val="FFFFFF"/>
               </w:rPr>
               <w:t>Story</w:t>
             </w:r>
@@ -111,7 +71,7 @@
         </w:tc>
         <w:tc>
           <w:tcPr>
-            <w:tcW w:type="dxa" w:w="4703"/>
+            <w:tcW w:type="dxa" w:w="4320"/>
           </w:tcPr>
           <w:p>
             <w:r>
@@ -123,26 +83,24 @@
       <w:tr>
         <w:tc>
           <w:tcPr>
-            <w:tcW w:type="dxa" w:w="4703"/>
-            <w:shd w:val="clear" w:color="auto" w:fill="FF6B6B"/>
+            <w:tcW w:type="dxa" w:w="4320"/>
           </w:tcPr>
           <w:p>
             <w:r>
               <w:rPr>
                 <w:b/>
-                <w:color w:val="FFFFFF"/>
               </w:rPr>
-              <w:t>Date Run</w:t>
+              <w:t>Initial Run</w:t>
             </w:r>
           </w:p>
         </w:tc>
         <w:tc>
           <w:tcPr>
-            <w:tcW w:type="dxa" w:w="4703"/>
+            <w:tcW w:type="dxa" w:w="4320"/>
           </w:tcPr>
           <w:p>
             <w:r>
-              <w:t>2026-03-09</w:t>
+              <w:t>2026-03-09 — 136 / 136 tests passing</w:t>
             </w:r>
           </w:p>
         </w:tc>
@@ -150,14 +108,37 @@
       <w:tr>
         <w:tc>
           <w:tcPr>
-            <w:tcW w:type="dxa" w:w="4703"/>
-            <w:shd w:val="clear" w:color="auto" w:fill="FF6B6B"/>
+            <w:tcW w:type="dxa" w:w="4320"/>
           </w:tcPr>
           <w:p>
             <w:r>
               <w:rPr>
                 <w:b/>
-                <w:color w:val="FFFFFF"/>
+              </w:rPr>
+              <w:t>After Fixes</w:t>
+            </w:r>
+          </w:p>
+        </w:tc>
+        <w:tc>
+          <w:tcPr>
+            <w:tcW w:type="dxa" w:w="4320"/>
+          </w:tcPr>
+          <w:p>
+            <w:r>
+              <w:t>2026-03-09 — 141 / 141 tests passing (5 new tests)</w:t>
+            </w:r>
+          </w:p>
+        </w:tc>
+      </w:tr>
+      <w:tr>
+        <w:tc>
+          <w:tcPr>
+            <w:tcW w:type="dxa" w:w="4320"/>
+          </w:tcPr>
+          <w:p>
+            <w:r>
+              <w:rPr>
+                <w:b/>
               </w:rPr>
               <w:t>Framework</w:t>
             </w:r>
@@ -165,11 +146,11 @@
         </w:tc>
         <w:tc>
           <w:tcPr>
-            <w:tcW w:type="dxa" w:w="4703"/>
+            <w:tcW w:type="dxa" w:w="4320"/>
           </w:tcPr>
           <w:p>
             <w:r>
-              <w:t>Vitest v1.6.1 (ES Module native)</w:t>
+              <w:t>Vitest v1.6.1</w:t>
             </w:r>
           </w:p>
         </w:tc>
@@ -177,14 +158,12 @@
       <w:tr>
         <w:tc>
           <w:tcPr>
-            <w:tcW w:type="dxa" w:w="4703"/>
-            <w:shd w:val="clear" w:color="auto" w:fill="FF6B6B"/>
+            <w:tcW w:type="dxa" w:w="4320"/>
           </w:tcPr>
           <w:p>
             <w:r>
               <w:rPr>
                 <w:b/>
-                <w:color w:val="FFFFFF"/>
               </w:rPr>
               <w:t>Result</w:t>
             </w:r>
@@ -192,167 +171,11 @@
         </w:tc>
         <w:tc>
           <w:tcPr>
-            <w:tcW w:type="dxa" w:w="4703"/>
-            <w:shd w:val="clear" w:color="auto" w:fill="D5F5E3"/>
+            <w:tcW w:type="dxa" w:w="4320"/>
           </w:tcPr>
           <w:p>
             <w:r>
-              <w:rPr>
-                <w:b/>
-                <w:color w:val="1E8B4C"/>
-              </w:rPr>
-              <w:t>✅  136 / 136 tests passing — 0 failures</w:t>
-            </w:r>
-          </w:p>
-        </w:tc>
-      </w:tr>
-    </w:tbl>
-    <w:p>
-      <w:r>
-        <w:br w:type="page"/>
-      </w:r>
-    </w:p>
-    <w:p>
-      <w:pPr>
-        <w:pStyle w:val="Heading1"/>
-      </w:pPr>
-      <w:r>
-        <w:rPr>
-          <w:color w:val="FF6B6B"/>
-        </w:rPr>
-        <w:t>1.  How the Tests Were Built — The Process</w:t>
-      </w:r>
-    </w:p>
-    <w:p>
-      <w:pPr>
-        <w:pStyle w:val="Heading2"/>
-      </w:pPr>
-      <w:r>
-        <w:rPr>
-          <w:color w:val="2980B9"/>
-        </w:rPr>
-        <w:t>Step 1 — Read the Source Documents</w:t>
-      </w:r>
-    </w:p>
-    <w:p>
-      <w:r>
-        <w:rPr>
-          <w:b w:val="0"/>
-          <w:sz w:val="22"/>
-        </w:rPr>
-        <w:t>Three files in 2ndStoryFiles/ defined the requirements and testing methodology:</w:t>
-      </w:r>
-    </w:p>
-    <w:tbl>
-      <w:tblPr>
-        <w:tblStyle w:val="TableGrid"/>
-        <w:tblW w:type="auto" w:w="0"/>
-        <w:tblLook w:firstColumn="1" w:firstRow="1" w:lastColumn="0" w:lastRow="0" w:noHBand="0" w:noVBand="1" w:val="04A0"/>
-      </w:tblPr>
-      <w:tblGrid>
-        <w:gridCol w:w="4703"/>
-        <w:gridCol w:w="4703"/>
-      </w:tblGrid>
-      <w:tr>
-        <w:tc>
-          <w:tcPr>
-            <w:tcW w:type="dxa" w:w="4703"/>
-            <w:shd w:val="clear" w:color="auto" w:fill="2C3E50"/>
-          </w:tcPr>
-          <w:p>
-            <w:r>
-              <w:rPr>
-                <w:b/>
-                <w:color w:val="FFFFFF"/>
-              </w:rPr>
-              <w:t>Document</w:t>
-            </w:r>
-          </w:p>
-        </w:tc>
-        <w:tc>
-          <w:tcPr>
-            <w:tcW w:type="dxa" w:w="4703"/>
-            <w:shd w:val="clear" w:color="auto" w:fill="2C3E50"/>
-          </w:tcPr>
-          <w:p>
-            <w:r>
-              <w:rPr>
-                <w:b/>
-                <w:color w:val="FFFFFF"/>
-              </w:rPr>
-              <w:t>What It Told Us</w:t>
-            </w:r>
-          </w:p>
-        </w:tc>
-      </w:tr>
-      <w:tr>
-        <w:tc>
-          <w:tcPr>
-            <w:tcW w:type="dxa" w:w="4703"/>
-            <w:shd w:val="clear" w:color="auto" w:fill="FFFFFF"/>
-          </w:tcPr>
-          <w:p>
-            <w:r>
-              <w:t>Story.txt</w:t>
-            </w:r>
-          </w:p>
-        </w:tc>
-        <w:tc>
-          <w:tcPr>
-            <w:tcW w:type="dxa" w:w="4703"/>
-            <w:shd w:val="clear" w:color="auto" w:fill="FFFFFF"/>
-          </w:tcPr>
-          <w:p>
-            <w:r>
-              <w:t>The 10 functional requirements FR-31 through FR-40 with exact requirement wording</w:t>
-            </w:r>
-          </w:p>
-        </w:tc>
-      </w:tr>
-      <w:tr>
-        <w:tc>
-          <w:tcPr>
-            <w:tcW w:type="dxa" w:w="4703"/>
-            <w:shd w:val="clear" w:color="auto" w:fill="EBF5FB"/>
-          </w:tcPr>
-          <w:p>
-            <w:r>
-              <w:t>1stIterationAcceptanceTesting.pdf</w:t>
-            </w:r>
-          </w:p>
-        </w:tc>
-        <w:tc>
-          <w:tcPr>
-            <w:tcW w:type="dxa" w:w="4703"/>
-            <w:shd w:val="clear" w:color="auto" w:fill="EBF5FB"/>
-          </w:tcPr>
-          <w:p>
-            <w:r>
-              <w:t>Tests must be automated, submitted to Git, and runnable by the instructor as a customer</w:t>
-            </w:r>
-          </w:p>
-        </w:tc>
-      </w:tr>
-      <w:tr>
-        <w:tc>
-          <w:tcPr>
-            <w:tcW w:type="dxa" w:w="4703"/>
-            <w:shd w:val="clear" w:color="auto" w:fill="FFFFFF"/>
-          </w:tcPr>
-          <w:p>
-            <w:r>
-              <w:t>08_XPandJUnit.pdf</w:t>
-            </w:r>
-          </w:p>
-        </w:tc>
-        <w:tc>
-          <w:tcPr>
-            <w:tcW w:type="dxa" w:w="4703"/>
-            <w:shd w:val="clear" w:color="auto" w:fill="FFFFFF"/>
-          </w:tcPr>
-          <w:p>
-            <w:r>
-              <w:t>XP methodology — Customer Tests, TDD, unit testing philosophy (adapted from JUnit to Vitest)</w:t>
+              <w:t>PASS: 141 / 141 — 0 failures</w:t>
             </w:r>
           </w:p>
         </w:tc>
@@ -364,49 +187,12 @@
         <w:pStyle w:val="Heading2"/>
       </w:pPr>
       <w:r>
-        <w:rPr>
-          <w:color w:val="E74C3C"/>
-        </w:rPr>
-        <w:t>Step 2 — First Mistake: Wrong Project</w:t>
+        <w:t>1. How the Tests Were Built</w:t>
       </w:r>
     </w:p>
     <w:p>
       <w:r>
-        <w:rPr>
-          <w:b w:val="0"/>
-          <w:color w:val="7F0000"/>
-          <w:sz w:val="22"/>
-        </w:rPr>
-        <w:t>The first attempt placed tests in TenderPrototype/test_cases/ targeting the old Express + SQLite backend using Jest + Supertest. Tests hit HTTP endpoints like GET /api/recipes and used snake_case field names (cook_time).</w:t>
-      </w:r>
-    </w:p>
-    <w:p>
-      <w:r>
-        <w:rPr>
-          <w:b w:val="0"/>
-          <w:sz w:val="22"/>
-        </w:rPr>
-        <w:t>This was incorrect. The new Firebase rebuild has no backend server at all. The user corrected this and a new test_cases/ folder was created at the root of the Firebase project.</w:t>
-      </w:r>
-    </w:p>
-    <w:p>
-      <w:pPr>
-        <w:pStyle w:val="Heading2"/>
-      </w:pPr>
-      <w:r>
-        <w:rPr>
-          <w:color w:val="2980B9"/>
-        </w:rPr>
-        <w:t>Step 3 — Read the Firebase App Source Files</w:t>
-      </w:r>
-    </w:p>
-    <w:p>
-      <w:r>
-        <w:rPr>
-          <w:b w:val="0"/>
-          <w:sz w:val="22"/>
-        </w:rPr>
-        <w:t>Every relevant source file was read before writing a single test:</w:t>
+        <w:t>Three source documents in 2ndStoryFiles/ defined requirements and methodology.</w:t>
       </w:r>
     </w:p>
     <w:tbl>
@@ -416,37 +202,33 @@
         <w:tblLook w:firstColumn="1" w:firstRow="1" w:lastColumn="0" w:lastRow="0" w:noHBand="0" w:noVBand="1" w:val="04A0"/>
       </w:tblPr>
       <w:tblGrid>
-        <w:gridCol w:w="4703"/>
-        <w:gridCol w:w="4703"/>
+        <w:gridCol w:w="4320"/>
+        <w:gridCol w:w="4320"/>
       </w:tblGrid>
       <w:tr>
         <w:tc>
           <w:tcPr>
-            <w:tcW w:type="dxa" w:w="4703"/>
-            <w:shd w:val="clear" w:color="auto" w:fill="2C3E50"/>
+            <w:tcW w:type="dxa" w:w="4320"/>
           </w:tcPr>
           <w:p>
             <w:r>
               <w:rPr>
                 <w:b/>
-                <w:color w:val="FFFFFF"/>
               </w:rPr>
-              <w:t>File Read</w:t>
+              <w:t>Document</w:t>
             </w:r>
           </w:p>
         </w:tc>
         <w:tc>
           <w:tcPr>
-            <w:tcW w:type="dxa" w:w="4703"/>
-            <w:shd w:val="clear" w:color="auto" w:fill="2C3E50"/>
+            <w:tcW w:type="dxa" w:w="4320"/>
           </w:tcPr>
           <w:p>
             <w:r>
               <w:rPr>
                 <w:b/>
-                <w:color w:val="FFFFFF"/>
               </w:rPr>
-              <w:t>Why</w:t>
+              <w:t>What It Told Us</w:t>
             </w:r>
           </w:p>
         </w:tc>
@@ -454,23 +236,21 @@
       <w:tr>
         <w:tc>
           <w:tcPr>
-            <w:tcW w:type="dxa" w:w="4703"/>
-            <w:shd w:val="clear" w:color="auto" w:fill="FFFFFF"/>
+            <w:tcW w:type="dxa" w:w="4320"/>
           </w:tcPr>
           <w:p>
             <w:r>
-              <w:t>src/pages/discover.js</w:t>
+              <w:t>Story.txt</w:t>
             </w:r>
           </w:p>
         </w:tc>
         <w:tc>
           <w:tcPr>
-            <w:tcW w:type="dxa" w:w="4703"/>
-            <w:shd w:val="clear" w:color="auto" w:fill="FFFFFF"/>
+            <w:tcW w:type="dxa" w:w="4320"/>
           </w:tcPr>
           <w:p>
             <w:r>
-              <w:t>Core filter logic (filterAndRender) and rendering</w:t>
+              <w:t>FR-31 through FR-40 requirement wording</w:t>
             </w:r>
           </w:p>
         </w:tc>
@@ -478,23 +258,21 @@
       <w:tr>
         <w:tc>
           <w:tcPr>
-            <w:tcW w:type="dxa" w:w="4703"/>
-            <w:shd w:val="clear" w:color="auto" w:fill="EBF5FB"/>
+            <w:tcW w:type="dxa" w:w="4320"/>
           </w:tcPr>
           <w:p>
             <w:r>
-              <w:t>src/api/recipes.js</w:t>
+              <w:t>1stIterationAcceptanceTesting.pdf</w:t>
             </w:r>
           </w:p>
         </w:tc>
         <w:tc>
           <w:tcPr>
-            <w:tcW w:type="dxa" w:w="4703"/>
-            <w:shd w:val="clear" w:color="auto" w:fill="EBF5FB"/>
+            <w:tcW w:type="dxa" w:w="4320"/>
           </w:tcPr>
           <w:p>
             <w:r>
-              <w:t>How Firestore reads/writes recipes and likes</w:t>
+              <w:t>Tests must be automated, in Git, runnable by instructor</w:t>
             </w:r>
           </w:p>
         </w:tc>
@@ -502,143 +280,21 @@
       <w:tr>
         <w:tc>
           <w:tcPr>
-            <w:tcW w:type="dxa" w:w="4703"/>
-            <w:shd w:val="clear" w:color="auto" w:fill="FFFFFF"/>
+            <w:tcW w:type="dxa" w:w="4320"/>
           </w:tcPr>
           <w:p>
             <w:r>
-              <w:t>src/components/recipeModal.js</w:t>
+              <w:t>08_XPandJUnit.pdf</w:t>
             </w:r>
           </w:p>
         </w:tc>
         <w:tc>
           <w:tcPr>
-            <w:tcW w:type="dxa" w:w="4703"/>
-            <w:shd w:val="clear" w:color="auto" w:fill="FFFFFF"/>
+            <w:tcW w:type="dxa" w:w="4320"/>
           </w:tcPr>
           <w:p>
             <w:r>
-              <w:t>What fields the detail modal reads</w:t>
-            </w:r>
-          </w:p>
-        </w:tc>
-      </w:tr>
-      <w:tr>
-        <w:tc>
-          <w:tcPr>
-            <w:tcW w:type="dxa" w:w="4703"/>
-            <w:shd w:val="clear" w:color="auto" w:fill="EBF5FB"/>
-          </w:tcPr>
-          <w:p>
-            <w:r>
-              <w:t>src/components/addRecipeModal.js</w:t>
-            </w:r>
-          </w:p>
-        </w:tc>
-        <w:tc>
-          <w:tcPr>
-            <w:tcW w:type="dxa" w:w="4703"/>
-            <w:shd w:val="clear" w:color="auto" w:fill="EBF5FB"/>
-          </w:tcPr>
-          <w:p>
-            <w:r>
-              <w:t>Form fields, validation, constants (cuisine/dietary/difficulty)</w:t>
-            </w:r>
-          </w:p>
-        </w:tc>
-      </w:tr>
-      <w:tr>
-        <w:tc>
-          <w:tcPr>
-            <w:tcW w:type="dxa" w:w="4703"/>
-            <w:shd w:val="clear" w:color="auto" w:fill="FFFFFF"/>
-          </w:tcPr>
-          <w:p>
-            <w:r>
-              <w:t>src/utils/helpers.js</w:t>
-            </w:r>
-          </w:p>
-        </w:tc>
-        <w:tc>
-          <w:tcPr>
-            <w:tcW w:type="dxa" w:w="4703"/>
-            <w:shd w:val="clear" w:color="auto" w:fill="FFFFFF"/>
-          </w:tcPr>
-          <w:p>
-            <w:r>
-              <w:t>Pure functions: parseIngredients, escapeHtml, capitalizeFirst</w:t>
-            </w:r>
-          </w:p>
-        </w:tc>
-      </w:tr>
-      <w:tr>
-        <w:tc>
-          <w:tcPr>
-            <w:tcW w:type="dxa" w:w="4703"/>
-            <w:shd w:val="clear" w:color="auto" w:fill="EBF5FB"/>
-          </w:tcPr>
-          <w:p>
-            <w:r>
-              <w:t>discover.html</w:t>
-            </w:r>
-          </w:p>
-        </w:tc>
-        <w:tc>
-          <w:tcPr>
-            <w:tcW w:type="dxa" w:w="4703"/>
-            <w:shd w:val="clear" w:color="auto" w:fill="EBF5FB"/>
-          </w:tcPr>
-          <w:p>
-            <w:r>
-              <w:t>What DOM elements exist, what filter controls are present</w:t>
-            </w:r>
-          </w:p>
-        </w:tc>
-      </w:tr>
-      <w:tr>
-        <w:tc>
-          <w:tcPr>
-            <w:tcW w:type="dxa" w:w="4703"/>
-            <w:shd w:val="clear" w:color="auto" w:fill="FFFFFF"/>
-          </w:tcPr>
-          <w:p>
-            <w:r>
-              <w:t>package.json</w:t>
-            </w:r>
-          </w:p>
-        </w:tc>
-        <w:tc>
-          <w:tcPr>
-            <w:tcW w:type="dxa" w:w="4703"/>
-            <w:shd w:val="clear" w:color="auto" w:fill="FFFFFF"/>
-          </w:tcPr>
-          <w:p>
-            <w:r>
-              <w:t>Confirmed "type": "module" — ES modules, Vite project</w:t>
-            </w:r>
-          </w:p>
-        </w:tc>
-      </w:tr>
-      <w:tr>
-        <w:tc>
-          <w:tcPr>
-            <w:tcW w:type="dxa" w:w="4703"/>
-            <w:shd w:val="clear" w:color="auto" w:fill="EBF5FB"/>
-          </w:tcPr>
-          <w:p>
-            <w:r>
-              <w:t>src/api/users.js</w:t>
-            </w:r>
-          </w:p>
-        </w:tc>
-        <w:tc>
-          <w:tcPr>
-            <w:tcW w:type="dxa" w:w="4703"/>
-            <w:shd w:val="clear" w:color="auto" w:fill="EBF5FB"/>
-          </w:tcPr>
-          <w:p>
-            <w:r>
-              <w:t>User profile structure</w:t>
+              <w:t>XP methodology: Customer Tests, TDD, unit test philosophy</w:t>
             </w:r>
           </w:p>
         </w:tc>
@@ -646,211 +302,136 @@
     </w:tbl>
     <w:p/>
     <w:p>
+      <w:r>
+        <w:t>Vitest chosen over Jest: project uses "type": "module" (native ES modules); Jest needs Babel. Vitest works out of the box with zero config. A shared helper (test_cases/helpers/discoverHelpers.js) mirrors app filter logic with no Firebase imports — testable in Node.</w:t>
+      </w:r>
+    </w:p>
+    <w:p>
       <w:pPr>
         <w:pStyle w:val="Heading2"/>
       </w:pPr>
       <w:r>
-        <w:rPr>
-          <w:color w:val="2980B9"/>
-        </w:rPr>
-        <w:t>Step 4 — Choose the Right Test Framework</w:t>
-      </w:r>
-    </w:p>
-    <w:p>
-      <w:r>
-        <w:rPr>
-          <w:b w:val="0"/>
-          <w:sz w:val="22"/>
-        </w:rPr>
-        <w:t>The original tests used Jest (CommonJS). The Firebase app uses "type": "module" — native ES modules — which Jest does not support without a complex Babel setup.</w:t>
+        <w:t>2. Errors &amp; Corrections During Test Development</w:t>
       </w:r>
     </w:p>
     <w:p>
       <w:r>
         <w:rPr>
           <w:b/>
-          <w:sz w:val="22"/>
+          <w:color w:val="C0392B"/>
         </w:rPr>
-        <w:t>Vitest was chosen because:</w:t>
-      </w:r>
-    </w:p>
-    <w:p>
-      <w:pPr>
-        <w:pStyle w:val="ListBullet"/>
-      </w:pPr>
-      <w:r>
-        <w:rPr>
-          <w:sz w:val="22"/>
-        </w:rPr>
-        <w:t>It is the official testing companion for Vite projects</w:t>
-      </w:r>
-    </w:p>
-    <w:p>
-      <w:pPr>
-        <w:pStyle w:val="ListBullet"/>
-      </w:pPr>
-      <w:r>
-        <w:rPr>
-          <w:sz w:val="22"/>
-        </w:rPr>
-        <w:t>It supports ES modules natively with zero configuration</w:t>
-      </w:r>
-    </w:p>
-    <w:p>
-      <w:pPr>
-        <w:pStyle w:val="ListBullet"/>
-      </w:pPr>
-      <w:r>
-        <w:rPr>
-          <w:sz w:val="22"/>
-        </w:rPr>
-        <w:t>It uses the identical describe / test / expect API as Jest</w:t>
-      </w:r>
-    </w:p>
-    <w:p>
-      <w:pPr>
-        <w:pStyle w:val="ListBullet"/>
-      </w:pPr>
-      <w:r>
-        <w:rPr>
-          <w:sz w:val="22"/>
-        </w:rPr>
-        <w:t>It runs all 136 tests in approximately 1 second</w:t>
-      </w:r>
-    </w:p>
-    <w:p/>
-    <w:p>
-      <w:pPr>
-        <w:pStyle w:val="Heading2"/>
-      </w:pPr>
-      <w:r>
-        <w:rPr>
-          <w:color w:val="2980B9"/>
-        </w:rPr>
-        <w:t>Step 5 — Build the Shared Helper File</w:t>
+        <w:t>Error 1 — Wrong Project Targeted</w:t>
       </w:r>
     </w:p>
     <w:p>
       <w:r>
-        <w:rPr>
-          <w:b w:val="0"/>
-          <w:sz w:val="22"/>
-        </w:rPr>
-        <w:t>Because the Firebase app's filter logic lives inside filterAndRender() in discover.js (not exported), and because src/api/recipes.js imports Firebase which cannot run in Node without the Firebase Emulator, a shared helper file was created:</w:t>
-      </w:r>
-    </w:p>
-    <w:p>
-      <w:pPr>
-        <w:spacing w:before="40" w:after="40"/>
-        <w:ind w:left="432"/>
-      </w:pPr>
-      <w:r>
-        <w:rPr>
-          <w:rFonts w:ascii="Courier New" w:hAnsi="Courier New"/>
-          <w:color w:val="1A1A2E"/>
-          <w:sz w:val="18"/>
-        </w:rPr>
-        <w:t>test_cases/helpers/discoverHelpers.js</w:t>
-      </w:r>
-    </w:p>
-    <w:p>
-      <w:r>
-        <w:rPr>
-          <w:b w:val="0"/>
-          <w:sz w:val="22"/>
-        </w:rPr>
-        <w:t>This file contains pure JavaScript logic mirrored from the source files with no Firebase imports. It is the bridge between the app's untestable Firebase code and the unit-testable pure logic.</w:t>
-      </w:r>
-    </w:p>
-    <w:p/>
-    <w:p>
-      <w:pPr>
-        <w:pStyle w:val="Heading2"/>
-      </w:pPr>
-      <w:r>
-        <w:rPr>
-          <w:color w:val="2980B9"/>
-        </w:rPr>
-        <w:t>Step 6 — Write the 10 Test Files</w:t>
-      </w:r>
-    </w:p>
-    <w:p>
-      <w:r>
-        <w:rPr>
-          <w:b w:val="0"/>
-          <w:sz w:val="22"/>
-        </w:rPr>
-        <w:t>One file per functional requirement (FR-31 to FR-40). Each file follows this structure:</w:t>
-      </w:r>
-    </w:p>
-    <w:p>
-      <w:pPr>
-        <w:pStyle w:val="ListBullet"/>
-      </w:pPr>
-      <w:r>
-        <w:rPr>
-          <w:sz w:val="22"/>
-        </w:rPr>
-        <w:t>JSDoc header with the requirement text, source file reference, and test strategy</w:t>
-      </w:r>
-    </w:p>
-    <w:p>
-      <w:pPr>
-        <w:pStyle w:val="ListBullet"/>
-      </w:pPr>
-      <w:r>
-        <w:rPr>
-          <w:sz w:val="22"/>
-        </w:rPr>
-        <w:t>Sample recipe fixtures matching the Firestore data shape (camelCase fields, arrays)</w:t>
-      </w:r>
-    </w:p>
-    <w:p>
-      <w:pPr>
-        <w:pStyle w:val="ListBullet"/>
-      </w:pPr>
-      <w:r>
-        <w:rPr>
-          <w:sz w:val="22"/>
-        </w:rPr>
-        <w:t>describe block with numbered test cases (TC-XX-YY)</w:t>
-      </w:r>
-    </w:p>
-    <w:p>
-      <w:pPr>
-        <w:pStyle w:val="ListBullet"/>
-      </w:pPr>
-      <w:r>
-        <w:rPr>
-          <w:sz w:val="22"/>
-        </w:rPr>
-        <w:t>NOTE comment listing browser/Firestore concerns requiring e2e testing</w:t>
-      </w:r>
-    </w:p>
-    <w:p>
-      <w:r>
-        <w:br w:type="page"/>
-      </w:r>
-    </w:p>
-    <w:p>
-      <w:pPr>
-        <w:pStyle w:val="Heading1"/>
-      </w:pPr>
-      <w:r>
-        <w:rPr>
-          <w:color w:val="E74C3C"/>
-        </w:rPr>
-        <w:t>2.  Errors &amp; Corrections Along the Way</w:t>
+        <w:t>Initial tests targeted TenderPrototype/ (Express/SQLite) using Jest+Supertest. User corrected: test the new Firebase app. New test_cases/ created at project root.</w:t>
       </w:r>
     </w:p>
     <w:p>
       <w:r>
         <w:rPr>
           <w:b/>
-          <w:color w:val="E74C3C"/>
-          <w:sz w:val="24"/>
+          <w:color w:val="C0392B"/>
         </w:rPr>
-        <w:t xml:space="preserve">  Error 1 — Tests Written for the Wrong Project</w:t>
+        <w:t>Error 2 — Wrong Field Names</w:t>
+      </w:r>
+    </w:p>
+    <w:p>
+      <w:r>
+        <w:t>Prototype used cook_time (snake_case). Firebase app uses cookTime (camelCase). Fixed throughout all fixtures and assertions.</w:t>
+      </w:r>
+    </w:p>
+    <w:p>
+      <w:r>
+        <w:rPr>
+          <w:b/>
+          <w:color w:val="C0392B"/>
+        </w:rPr>
+        <w:t>Error 3 — Wrong Difficulty Case</w:t>
+      </w:r>
+    </w:p>
+    <w:p>
+      <w:r>
+        <w:t>Prototype stored "Easy". Firebase stores "easy" (lowercase). Filter uses strict equality. TC-35-06 documents this behaviour.</w:t>
+      </w:r>
+    </w:p>
+    <w:p>
+      <w:r>
+        <w:rPr>
+          <w:b/>
+          <w:color w:val="C0392B"/>
+        </w:rPr>
+        <w:t>Error 4 — Wrong Dietary Field</w:t>
+      </w:r>
+    </w:p>
+    <w:p>
+      <w:r>
+        <w:t>Prototype used dietary_tags. Firebase app uses dietary. Fixed throughout.</w:t>
+      </w:r>
+    </w:p>
+    <w:p>
+      <w:r>
+        <w:rPr>
+          <w:b/>
+          <w:color w:val="C0392B"/>
+        </w:rPr>
+        <w:t>Error 5 — Cuisine Filter Case</w:t>
+      </w:r>
+    </w:p>
+    <w:p>
+      <w:r>
+        <w:t>filterByCuisine() initially written case-insensitive. discover.js uses strict equality. TC-34-07 documents this.</w:t>
+      </w:r>
+    </w:p>
+    <w:p>
+      <w:r>
+        <w:rPr>
+          <w:b/>
+          <w:color w:val="C0392B"/>
+        </w:rPr>
+        <w:t>Error 6 — Ingredients as Array</w:t>
+      </w:r>
+    </w:p>
+    <w:p>
+      <w:r>
+        <w:t>Prototype stored newline string. Firebase stores string array. parseIngredients() handles both. TC-33-15 tests string fallback.</w:t>
+      </w:r>
+    </w:p>
+    <w:p>
+      <w:r>
+        <w:rPr>
+          <w:b/>
+          <w:color w:val="C0392B"/>
+        </w:rPr>
+        <w:t>Error 7 — No HTTP API for Likes</w:t>
+      </w:r>
+    </w:p>
+    <w:p>
+      <w:r>
+        <w:t>No REST API exists. FR-38 redesigned to test client-side Set&lt;string&gt; state operations instead.</w:t>
+      </w:r>
+    </w:p>
+    <w:p>
+      <w:r>
+        <w:rPr>
+          <w:b/>
+          <w:color w:val="C0392B"/>
+        </w:rPr>
+        <w:t>Error 8 — FR-39 Not Implemented</w:t>
+      </w:r>
+    </w:p>
+    <w:p>
+      <w:r>
+        <w:t>Add to Plan button was entirely missing. FR-39 tests validated logic; feature flagged for fix.</w:t>
+      </w:r>
+    </w:p>
+    <w:p>
+      <w:pPr>
+        <w:pStyle w:val="Heading2"/>
+      </w:pPr>
+      <w:r>
+        <w:t>3. Key Findings (Before Fixes)</w:t>
       </w:r>
     </w:p>
     <w:tbl>
@@ -860,32 +441,61 @@
         <w:tblLook w:firstColumn="1" w:firstRow="1" w:lastColumn="0" w:lastRow="0" w:noHBand="0" w:noVBand="1" w:val="04A0"/>
       </w:tblPr>
       <w:tblGrid>
-        <w:gridCol w:w="4703"/>
-        <w:gridCol w:w="4703"/>
+        <w:gridCol w:w="2160"/>
+        <w:gridCol w:w="2160"/>
+        <w:gridCol w:w="2160"/>
+        <w:gridCol w:w="2160"/>
       </w:tblGrid>
       <w:tr>
         <w:tc>
           <w:tcPr>
-            <w:tcW w:type="dxa" w:w="4703"/>
-            <w:shd w:val="clear" w:color="auto" w:fill="C0392B"/>
+            <w:tcW w:type="dxa" w:w="2160"/>
           </w:tcPr>
           <w:p>
             <w:r>
               <w:rPr>
                 <w:b/>
-                <w:color w:val="FFFFFF"/>
               </w:rPr>
-              <w:t>What happened</w:t>
+              <w:t>Finding</w:t>
             </w:r>
           </w:p>
         </w:tc>
         <w:tc>
           <w:tcPr>
-            <w:tcW w:type="dxa" w:w="4703"/>
+            <w:tcW w:type="dxa" w:w="2160"/>
           </w:tcPr>
           <w:p>
             <w:r>
-              <w:t>The first pass of tests targeted TenderPrototype/ (the old Express app) using supertest to call HTTP endpoints.</w:t>
+              <w:rPr>
+                <w:b/>
+              </w:rPr>
+              <w:t>FR</w:t>
+            </w:r>
+          </w:p>
+        </w:tc>
+        <w:tc>
+          <w:tcPr>
+            <w:tcW w:type="dxa" w:w="2160"/>
+          </w:tcPr>
+          <w:p>
+            <w:r>
+              <w:rPr>
+                <w:b/>
+              </w:rPr>
+              <w:t>Description</w:t>
+            </w:r>
+          </w:p>
+        </w:tc>
+        <w:tc>
+          <w:tcPr>
+            <w:tcW w:type="dxa" w:w="2160"/>
+          </w:tcPr>
+          <w:p>
+            <w:r>
+              <w:rPr>
+                <w:b/>
+              </w:rPr>
+              <w:t>Status</w:t>
             </w:r>
           </w:p>
         </w:tc>
@@ -893,26 +503,41 @@
       <w:tr>
         <w:tc>
           <w:tcPr>
-            <w:tcW w:type="dxa" w:w="4703"/>
-            <w:shd w:val="clear" w:color="auto" w:fill="1A5276"/>
+            <w:tcW w:type="dxa" w:w="2160"/>
           </w:tcPr>
           <w:p>
             <w:r>
-              <w:rPr>
-                <w:b/>
-                <w:color w:val="FFFFFF"/>
-              </w:rPr>
-              <w:t>Discovered by</w:t>
+              <w:t>Finding 1 — Dietary Filter Not Wired</w:t>
             </w:r>
           </w:p>
         </w:tc>
         <w:tc>
           <w:tcPr>
-            <w:tcW w:type="dxa" w:w="4703"/>
+            <w:tcW w:type="dxa" w:w="2160"/>
           </w:tcPr>
           <w:p>
             <w:r>
-              <w:t>User feedback — "I am not trying to test the prototype, I am trying to test the new website."</w:t>
+              <w:t>FR-36</w:t>
+            </w:r>
+          </w:p>
+        </w:tc>
+        <w:tc>
+          <w:tcPr>
+            <w:tcW w:type="dxa" w:w="2160"/>
+          </w:tcPr>
+          <w:p>
+            <w:r>
+              <w:t>filterAndRender() had no dietary step; chips/filter absent</w:t>
+            </w:r>
+          </w:p>
+        </w:tc>
+        <w:tc>
+          <w:tcPr>
+            <w:tcW w:type="dxa" w:w="2160"/>
+          </w:tcPr>
+          <w:p>
+            <w:r>
+              <w:t>FIXED — Fix 1</w:t>
             </w:r>
           </w:p>
         </w:tc>
@@ -920,40 +545,266 @@
       <w:tr>
         <w:tc>
           <w:tcPr>
-            <w:tcW w:type="dxa" w:w="4703"/>
-            <w:shd w:val="clear" w:color="auto" w:fill="1E8B4C"/>
+            <w:tcW w:type="dxa" w:w="2160"/>
           </w:tcPr>
           <w:p>
             <w:r>
-              <w:rPr>
-                <w:b/>
-                <w:color w:val="FFFFFF"/>
-              </w:rPr>
-              <w:t>Correction</w:t>
+              <w:t>Finding 2 — Add to Plan Missing</w:t>
             </w:r>
           </w:p>
         </w:tc>
         <w:tc>
           <w:tcPr>
-            <w:tcW w:type="dxa" w:w="4703"/>
+            <w:tcW w:type="dxa" w:w="2160"/>
           </w:tcPr>
           <w:p>
             <w:r>
-              <w:t>Scrapped prototype tests. Created test_cases/ at project root targeting Firebase app source files.</w:t>
+              <w:t>FR-39</w:t>
+            </w:r>
+          </w:p>
+        </w:tc>
+        <w:tc>
+          <w:tcPr>
+            <w:tcW w:type="dxa" w:w="2160"/>
+          </w:tcPr>
+          <w:p>
+            <w:r>
+              <w:t>No button in renderGrid(); FR-39 unimplemented</w:t>
+            </w:r>
+          </w:p>
+        </w:tc>
+        <w:tc>
+          <w:tcPr>
+            <w:tcW w:type="dxa" w:w="2160"/>
+          </w:tcPr>
+          <w:p>
+            <w:r>
+              <w:t>FIXED — Fix 2</w:t>
+            </w:r>
+          </w:p>
+        </w:tc>
+      </w:tr>
+      <w:tr>
+        <w:tc>
+          <w:tcPr>
+            <w:tcW w:type="dxa" w:w="2160"/>
+          </w:tcPr>
+          <w:p>
+            <w:r>
+              <w:t>Finding 3 — No Like Count</w:t>
+            </w:r>
+          </w:p>
+        </w:tc>
+        <w:tc>
+          <w:tcPr>
+            <w:tcW w:type="dxa" w:w="2160"/>
+          </w:tcPr>
+          <w:p>
+            <w:r>
+              <w:t>FR-32</w:t>
+            </w:r>
+          </w:p>
+        </w:tc>
+        <w:tc>
+          <w:tcPr>
+            <w:tcW w:type="dxa" w:w="2160"/>
+          </w:tcPr>
+          <w:p>
+            <w:r>
+              <w:t>No aggregate count field; per-user swipe only</w:t>
+            </w:r>
+          </w:p>
+        </w:tc>
+        <w:tc>
+          <w:tcPr>
+            <w:tcW w:type="dxa" w:w="2160"/>
+          </w:tcPr>
+          <w:p>
+            <w:r>
+              <w:t>FIXED — Fix 3</w:t>
+            </w:r>
+          </w:p>
+        </w:tc>
+      </w:tr>
+      <w:tr>
+        <w:tc>
+          <w:tcPr>
+            <w:tcW w:type="dxa" w:w="2160"/>
+          </w:tcPr>
+          <w:p>
+            <w:r>
+              <w:t>Finding 4 — Difficulty Dropdown</w:t>
+            </w:r>
+          </w:p>
+        </w:tc>
+        <w:tc>
+          <w:tcPr>
+            <w:tcW w:type="dxa" w:w="2160"/>
+          </w:tcPr>
+          <w:p>
+            <w:r>
+              <w:t>FR-35</w:t>
+            </w:r>
+          </w:p>
+        </w:tc>
+        <w:tc>
+          <w:tcPr>
+            <w:tcW w:type="dxa" w:w="2160"/>
+          </w:tcPr>
+          <w:p>
+            <w:r>
+              <w:t>&lt;select&gt; used instead of chip buttons</w:t>
+            </w:r>
+          </w:p>
+        </w:tc>
+        <w:tc>
+          <w:tcPr>
+            <w:tcW w:type="dxa" w:w="2160"/>
+          </w:tcPr>
+          <w:p>
+            <w:r>
+              <w:t>FIXED — Fix 4</w:t>
+            </w:r>
+          </w:p>
+        </w:tc>
+      </w:tr>
+      <w:tr>
+        <w:tc>
+          <w:tcPr>
+            <w:tcW w:type="dxa" w:w="2160"/>
+          </w:tcPr>
+          <w:p>
+            <w:r>
+              <w:t>Finding 5 — Cuisine Chips+Select</w:t>
+            </w:r>
+          </w:p>
+        </w:tc>
+        <w:tc>
+          <w:tcPr>
+            <w:tcW w:type="dxa" w:w="2160"/>
+          </w:tcPr>
+          <w:p>
+            <w:r>
+              <w:t>FR-34</w:t>
+            </w:r>
+          </w:p>
+        </w:tc>
+        <w:tc>
+          <w:tcPr>
+            <w:tcW w:type="dxa" w:w="2160"/>
+          </w:tcPr>
+          <w:p>
+            <w:r>
+              <w:t>Both wired and synced — works correctly</w:t>
+            </w:r>
+          </w:p>
+        </w:tc>
+        <w:tc>
+          <w:tcPr>
+            <w:tcW w:type="dxa" w:w="2160"/>
+          </w:tcPr>
+          <w:p>
+            <w:r>
+              <w:t>No fix needed</w:t>
             </w:r>
           </w:p>
         </w:tc>
       </w:tr>
     </w:tbl>
-    <w:p/>
+    <w:p>
+      <w:pPr>
+        <w:pStyle w:val="Heading2"/>
+      </w:pPr>
+      <w:r>
+        <w:t>4. Fixes Applied</w:t>
+      </w:r>
+    </w:p>
+    <w:p>
+      <w:pPr>
+        <w:pStyle w:val="Heading3"/>
+      </w:pPr>
+      <w:r>
+        <w:t>Fix 1 — Wire Dietary Filter (FR-36)</w:t>
+      </w:r>
+    </w:p>
+    <w:p>
+      <w:r>
+        <w:t>Added buildDietaryChips() in discover.js: 10 dietary options from addRecipeModal.js, multi-select AND logic, "All" chip clears selection. Added #dietaryChips div to discover.html. Updated filterAndRender() to include matchDietary step: every active tag must be in r.dietary.</w:t>
+      </w:r>
+    </w:p>
+    <w:p>
+      <w:pPr>
+        <w:pStyle w:val="Heading3"/>
+      </w:pPr>
+      <w:r>
+        <w:t>Fix 2 — Add to Plan Button (FR-39)</w:t>
+      </w:r>
+    </w:p>
+    <w:p>
+      <w:r>
+        <w:t>Added Plan button to each card in renderGrid(). Added #planModal overlay to discover.html with day select (7 days) and meal select (Breakfast/Lunch/Dinner). Added openPlanModal() / closePlanModal() in discover.js. Added addMealPlanEntry(uid, data) to src/api/recipes.js — writes to users/{uid}/mealplan/{auto-id} via addDoc().</w:t>
+      </w:r>
+    </w:p>
+    <w:p>
+      <w:pPr>
+        <w:pStyle w:val="Heading3"/>
+      </w:pPr>
+      <w:r>
+        <w:t>Fix 3 — Like Count on Cards (FR-32 / FR-38)</w:t>
+      </w:r>
+    </w:p>
+    <w:p>
+      <w:r>
+        <w:t>Added Firestore increment() import. likeRecipe() now calls Promise.all([setDoc(swipe), updateDoc(recipe, {likeCount: increment(1)})]). unlikeRecipe() calls increment(-1). renderGrid() shows hearts-N in card meta row. Click handler updates count client-side. Added 5 new tests TC-38-16 through TC-38-20.</w:t>
+      </w:r>
+    </w:p>
+    <w:p>
+      <w:pPr>
+        <w:pStyle w:val="Heading3"/>
+      </w:pPr>
+      <w:r>
+        <w:t>Fix 4 — Difficulty Filter Chips (FR-35)</w:t>
+      </w:r>
+    </w:p>
+    <w:p>
+      <w:r>
+        <w:t>Removed &lt;select id="difficultyFilter"&gt; from discover.html. Added #difficultyChips div with section label. Added buildDifficultyChips() in discover.js (All / Easy / Medium / Hard, single-select). Updated filterAndRender() to use activeDifficulty state variable. Removed old change event listener.</w:t>
+      </w:r>
+    </w:p>
+    <w:p>
+      <w:pPr>
+        <w:pStyle w:val="Heading2"/>
+      </w:pPr>
+      <w:r>
+        <w:t>5. Full Test Run Output (After Fixes)</w:t>
+      </w:r>
+    </w:p>
     <w:p>
       <w:r>
         <w:rPr>
-          <w:b/>
-          <w:color w:val="E67E22"/>
-          <w:sz w:val="24"/>
+          <w:rFonts w:ascii="Courier New" w:hAnsi="Courier New"/>
+          <w:sz w:val="18"/>
         </w:rPr>
-        <w:t xml:space="preserve">  Error 2 — Wrong Field Names (snake_case vs camelCase)</w:t>
+        <w:t>Test Files  10 passed (10)</w:t>
+        <w:br/>
+        <w:t xml:space="preserve">      Tests  141 passed (141)</w:t>
+        <w:br/>
+        <w:t xml:space="preserve">   Start at  17:41:47</w:t>
+        <w:br/>
+        <w:t xml:space="preserve">   Duration  1.17s</w:t>
+      </w:r>
+    </w:p>
+    <w:p>
+      <w:r>
+        <w:t>All 141 tests passed. Zero failures. Zero errors.</w:t>
+      </w:r>
+    </w:p>
+    <w:p>
+      <w:pPr>
+        <w:pStyle w:val="Heading2"/>
+      </w:pPr>
+      <w:r>
+        <w:t>6. Per-File Results</w:t>
       </w:r>
     </w:p>
     <w:tbl>
@@ -963,1040 +814,21 @@
         <w:tblLook w:firstColumn="1" w:firstRow="1" w:lastColumn="0" w:lastRow="0" w:noHBand="0" w:noVBand="1" w:val="04A0"/>
       </w:tblPr>
       <w:tblGrid>
-        <w:gridCol w:w="4703"/>
-        <w:gridCol w:w="4703"/>
+        <w:gridCol w:w="1728"/>
+        <w:gridCol w:w="1728"/>
+        <w:gridCol w:w="1728"/>
+        <w:gridCol w:w="1728"/>
+        <w:gridCol w:w="1728"/>
       </w:tblGrid>
       <w:tr>
         <w:tc>
           <w:tcPr>
-            <w:tcW w:type="dxa" w:w="4703"/>
-            <w:shd w:val="clear" w:color="auto" w:fill="C0392B"/>
+            <w:tcW w:type="dxa" w:w="1728"/>
           </w:tcPr>
           <w:p>
             <w:r>
               <w:rPr>
                 <w:b/>
-                <w:color w:val="FFFFFF"/>
-              </w:rPr>
-              <w:t>What happened</w:t>
-            </w:r>
-          </w:p>
-        </w:tc>
-        <w:tc>
-          <w:tcPr>
-            <w:tcW w:type="dxa" w:w="4703"/>
-          </w:tcPr>
-          <w:p>
-            <w:r>
-              <w:t>Initial tests used cook_time (snake_case), matching SQLite column names from the prototype.</w:t>
-            </w:r>
-          </w:p>
-        </w:tc>
-      </w:tr>
-      <w:tr>
-        <w:tc>
-          <w:tcPr>
-            <w:tcW w:type="dxa" w:w="4703"/>
-            <w:shd w:val="clear" w:color="auto" w:fill="1A5276"/>
-          </w:tcPr>
-          <w:p>
-            <w:r>
-              <w:rPr>
-                <w:b/>
-                <w:color w:val="FFFFFF"/>
-              </w:rPr>
-              <w:t>Discovered by</w:t>
-            </w:r>
-          </w:p>
-        </w:tc>
-        <w:tc>
-          <w:tcPr>
-            <w:tcW w:type="dxa" w:w="4703"/>
-          </w:tcPr>
-          <w:p>
-            <w:r>
-              <w:t>Reading addRecipeModal.js — the submit handler writes cookTime and prepTime (camelCase).</w:t>
-            </w:r>
-          </w:p>
-        </w:tc>
-      </w:tr>
-      <w:tr>
-        <w:tc>
-          <w:tcPr>
-            <w:tcW w:type="dxa" w:w="4703"/>
-            <w:shd w:val="clear" w:color="auto" w:fill="1E8B4C"/>
-          </w:tcPr>
-          <w:p>
-            <w:r>
-              <w:rPr>
-                <w:b/>
-                <w:color w:val="FFFFFF"/>
-              </w:rPr>
-              <w:t>Correction</w:t>
-            </w:r>
-          </w:p>
-        </w:tc>
-        <w:tc>
-          <w:tcPr>
-            <w:tcW w:type="dxa" w:w="4703"/>
-          </w:tcPr>
-          <w:p>
-            <w:r>
-              <w:t>All test fixtures and assertions use cookTime throughout. The difference is documented in the test headers.</w:t>
-            </w:r>
-          </w:p>
-        </w:tc>
-      </w:tr>
-    </w:tbl>
-    <w:p/>
-    <w:p>
-      <w:r>
-        <w:rPr>
-          <w:b/>
-          <w:color w:val="F39C12"/>
-          <w:sz w:val="24"/>
-        </w:rPr>
-        <w:t xml:space="preserve">  Error 3 — Wrong Difficulty Values (Title Case vs lowercase)</w:t>
-      </w:r>
-    </w:p>
-    <w:tbl>
-      <w:tblPr>
-        <w:tblStyle w:val="TableGrid"/>
-        <w:tblW w:type="auto" w:w="0"/>
-        <w:tblLook w:firstColumn="1" w:firstRow="1" w:lastColumn="0" w:lastRow="0" w:noHBand="0" w:noVBand="1" w:val="04A0"/>
-      </w:tblPr>
-      <w:tblGrid>
-        <w:gridCol w:w="4703"/>
-        <w:gridCol w:w="4703"/>
-      </w:tblGrid>
-      <w:tr>
-        <w:tc>
-          <w:tcPr>
-            <w:tcW w:type="dxa" w:w="4703"/>
-            <w:shd w:val="clear" w:color="auto" w:fill="C0392B"/>
-          </w:tcPr>
-          <w:p>
-            <w:r>
-              <w:rPr>
-                <w:b/>
-                <w:color w:val="FFFFFF"/>
-              </w:rPr>
-              <w:t>What happened</w:t>
-            </w:r>
-          </w:p>
-        </w:tc>
-        <w:tc>
-          <w:tcPr>
-            <w:tcW w:type="dxa" w:w="4703"/>
-          </w:tcPr>
-          <w:p>
-            <w:r>
-              <w:t>The prototype used "Easy", "Medium", "Hard" (title case). Initial tests reflected this.</w:t>
-            </w:r>
-          </w:p>
-        </w:tc>
-      </w:tr>
-      <w:tr>
-        <w:tc>
-          <w:tcPr>
-            <w:tcW w:type="dxa" w:w="4703"/>
-            <w:shd w:val="clear" w:color="auto" w:fill="1A5276"/>
-          </w:tcPr>
-          <w:p>
-            <w:r>
-              <w:rPr>
-                <w:b/>
-                <w:color w:val="FFFFFF"/>
-              </w:rPr>
-              <w:t>Discovered by</w:t>
-            </w:r>
-          </w:p>
-        </w:tc>
-        <w:tc>
-          <w:tcPr>
-            <w:tcW w:type="dxa" w:w="4703"/>
-          </w:tcPr>
-          <w:p>
-            <w:r>
-              <w:t>Reading discover.html — &lt;option value="easy"&gt; and filterAndRender() uses r.difficulty === difficulty (strict equality).</w:t>
-            </w:r>
-          </w:p>
-        </w:tc>
-      </w:tr>
-      <w:tr>
-        <w:tc>
-          <w:tcPr>
-            <w:tcW w:type="dxa" w:w="4703"/>
-            <w:shd w:val="clear" w:color="auto" w:fill="1E8B4C"/>
-          </w:tcPr>
-          <w:p>
-            <w:r>
-              <w:rPr>
-                <w:b/>
-                <w:color w:val="FFFFFF"/>
-              </w:rPr>
-              <w:t>Correction</w:t>
-            </w:r>
-          </w:p>
-        </w:tc>
-        <w:tc>
-          <w:tcPr>
-            <w:tcW w:type="dxa" w:w="4703"/>
-          </w:tcPr>
-          <w:p>
-            <w:r>
-              <w:t>All difficulty values use lowercase. TC-35-06 specifically documents the case-sensitive behaviour.</w:t>
-            </w:r>
-          </w:p>
-        </w:tc>
-      </w:tr>
-    </w:tbl>
-    <w:p/>
-    <w:p>
-      <w:r>
-        <w:rPr>
-          <w:b/>
-          <w:color w:val="F39C12"/>
-          <w:sz w:val="24"/>
-        </w:rPr>
-        <w:t xml:space="preserve">  Error 4 — Wrong Dietary Field Name</w:t>
-      </w:r>
-    </w:p>
-    <w:tbl>
-      <w:tblPr>
-        <w:tblStyle w:val="TableGrid"/>
-        <w:tblW w:type="auto" w:w="0"/>
-        <w:tblLook w:firstColumn="1" w:firstRow="1" w:lastColumn="0" w:lastRow="0" w:noHBand="0" w:noVBand="1" w:val="04A0"/>
-      </w:tblPr>
-      <w:tblGrid>
-        <w:gridCol w:w="4703"/>
-        <w:gridCol w:w="4703"/>
-      </w:tblGrid>
-      <w:tr>
-        <w:tc>
-          <w:tcPr>
-            <w:tcW w:type="dxa" w:w="4703"/>
-            <w:shd w:val="clear" w:color="auto" w:fill="C0392B"/>
-          </w:tcPr>
-          <w:p>
-            <w:r>
-              <w:rPr>
-                <w:b/>
-                <w:color w:val="FFFFFF"/>
-              </w:rPr>
-              <w:t>What happened</w:t>
-            </w:r>
-          </w:p>
-        </w:tc>
-        <w:tc>
-          <w:tcPr>
-            <w:tcW w:type="dxa" w:w="4703"/>
-          </w:tcPr>
-          <w:p>
-            <w:r>
-              <w:t>The prototype used dietary_tags as the field name. Initial helpers used this.</w:t>
-            </w:r>
-          </w:p>
-        </w:tc>
-      </w:tr>
-      <w:tr>
-        <w:tc>
-          <w:tcPr>
-            <w:tcW w:type="dxa" w:w="4703"/>
-            <w:shd w:val="clear" w:color="auto" w:fill="1A5276"/>
-          </w:tcPr>
-          <w:p>
-            <w:r>
-              <w:rPr>
-                <w:b/>
-                <w:color w:val="FFFFFF"/>
-              </w:rPr>
-              <w:t>Discovered by</w:t>
-            </w:r>
-          </w:p>
-        </w:tc>
-        <w:tc>
-          <w:tcPr>
-            <w:tcW w:type="dxa" w:w="4703"/>
-          </w:tcPr>
-          <w:p>
-            <w:r>
-              <w:t>Reading addRecipeModal.js submit handler — the field is written as dietary: [...] with no underscore.</w:t>
-            </w:r>
-          </w:p>
-        </w:tc>
-      </w:tr>
-      <w:tr>
-        <w:tc>
-          <w:tcPr>
-            <w:tcW w:type="dxa" w:w="4703"/>
-            <w:shd w:val="clear" w:color="auto" w:fill="1E8B4C"/>
-          </w:tcPr>
-          <w:p>
-            <w:r>
-              <w:rPr>
-                <w:b/>
-                <w:color w:val="FFFFFF"/>
-              </w:rPr>
-              <w:t>Correction</w:t>
-            </w:r>
-          </w:p>
-        </w:tc>
-        <w:tc>
-          <w:tcPr>
-            <w:tcW w:type="dxa" w:w="4703"/>
-          </w:tcPr>
-          <w:p>
-            <w:r>
-              <w:t>All test fixtures use dietary: [...] and filterByDietary() reads r.dietary.</w:t>
-            </w:r>
-          </w:p>
-        </w:tc>
-      </w:tr>
-    </w:tbl>
-    <w:p/>
-    <w:p>
-      <w:r>
-        <w:rPr>
-          <w:b/>
-          <w:color w:val="F39C12"/>
-          <w:sz w:val="24"/>
-        </w:rPr>
-        <w:t xml:space="preserve">  Error 5 — Wrong Cuisine Filter Behaviour (Case-Insensitive vs Exact Match)</w:t>
-      </w:r>
-    </w:p>
-    <w:tbl>
-      <w:tblPr>
-        <w:tblStyle w:val="TableGrid"/>
-        <w:tblW w:type="auto" w:w="0"/>
-        <w:tblLook w:firstColumn="1" w:firstRow="1" w:lastColumn="0" w:lastRow="0" w:noHBand="0" w:noVBand="1" w:val="04A0"/>
-      </w:tblPr>
-      <w:tblGrid>
-        <w:gridCol w:w="4703"/>
-        <w:gridCol w:w="4703"/>
-      </w:tblGrid>
-      <w:tr>
-        <w:tc>
-          <w:tcPr>
-            <w:tcW w:type="dxa" w:w="4703"/>
-            <w:shd w:val="clear" w:color="auto" w:fill="C0392B"/>
-          </w:tcPr>
-          <w:p>
-            <w:r>
-              <w:rPr>
-                <w:b/>
-                <w:color w:val="FFFFFF"/>
-              </w:rPr>
-              <w:t>What happened</w:t>
-            </w:r>
-          </w:p>
-        </w:tc>
-        <w:tc>
-          <w:tcPr>
-            <w:tcW w:type="dxa" w:w="4703"/>
-          </w:tcPr>
-          <w:p>
-            <w:r>
-              <w:t>The prototype filter lowercased both sides before comparing. A case-insensitive helper was initially written.</w:t>
-            </w:r>
-          </w:p>
-        </w:tc>
-      </w:tr>
-      <w:tr>
-        <w:tc>
-          <w:tcPr>
-            <w:tcW w:type="dxa" w:w="4703"/>
-            <w:shd w:val="clear" w:color="auto" w:fill="1A5276"/>
-          </w:tcPr>
-          <w:p>
-            <w:r>
-              <w:rPr>
-                <w:b/>
-                <w:color w:val="FFFFFF"/>
-              </w:rPr>
-              <w:t>Discovered by</w:t>
-            </w:r>
-          </w:p>
-        </w:tc>
-        <w:tc>
-          <w:tcPr>
-            <w:tcW w:type="dxa" w:w="4703"/>
-          </w:tcPr>
-          <w:p>
-            <w:r>
-              <w:t>Reading discover.js filterAndRender() — the matchCuisine line uses r.cuisine === cuisine (strict equality, no case folding).</w:t>
-            </w:r>
-          </w:p>
-        </w:tc>
-      </w:tr>
-      <w:tr>
-        <w:tc>
-          <w:tcPr>
-            <w:tcW w:type="dxa" w:w="4703"/>
-            <w:shd w:val="clear" w:color="auto" w:fill="1E8B4C"/>
-          </w:tcPr>
-          <w:p>
-            <w:r>
-              <w:rPr>
-                <w:b/>
-                <w:color w:val="FFFFFF"/>
-              </w:rPr>
-              <w:t>Correction</w:t>
-            </w:r>
-          </w:p>
-        </w:tc>
-        <w:tc>
-          <w:tcPr>
-            <w:tcW w:type="dxa" w:w="4703"/>
-          </w:tcPr>
-          <w:p>
-            <w:r>
-              <w:t>filterByCuisine() uses strict equality. TC-34-07 tests and documents this behaviour explicitly.</w:t>
-            </w:r>
-          </w:p>
-        </w:tc>
-      </w:tr>
-    </w:tbl>
-    <w:p/>
-    <w:p>
-      <w:r>
-        <w:rPr>
-          <w:b/>
-          <w:color w:val="27AE60"/>
-          <w:sz w:val="24"/>
-        </w:rPr>
-        <w:t xml:space="preserve">  Error 6 — Ingredients Stored as Array, Not String</w:t>
-      </w:r>
-    </w:p>
-    <w:tbl>
-      <w:tblPr>
-        <w:tblStyle w:val="TableGrid"/>
-        <w:tblW w:type="auto" w:w="0"/>
-        <w:tblLook w:firstColumn="1" w:firstRow="1" w:lastColumn="0" w:lastRow="0" w:noHBand="0" w:noVBand="1" w:val="04A0"/>
-      </w:tblPr>
-      <w:tblGrid>
-        <w:gridCol w:w="4703"/>
-        <w:gridCol w:w="4703"/>
-      </w:tblGrid>
-      <w:tr>
-        <w:tc>
-          <w:tcPr>
-            <w:tcW w:type="dxa" w:w="4703"/>
-            <w:shd w:val="clear" w:color="auto" w:fill="C0392B"/>
-          </w:tcPr>
-          <w:p>
-            <w:r>
-              <w:rPr>
-                <w:b/>
-                <w:color w:val="FFFFFF"/>
-              </w:rPr>
-              <w:t>What happened</w:t>
-            </w:r>
-          </w:p>
-        </w:tc>
-        <w:tc>
-          <w:tcPr>
-            <w:tcW w:type="dxa" w:w="4703"/>
-          </w:tcPr>
-          <w:p>
-            <w:r>
-              <w:t>The prototype stored ingredients as a single newline-separated string. Initial search tests searched the string directly.</w:t>
-            </w:r>
-          </w:p>
-        </w:tc>
-      </w:tr>
-      <w:tr>
-        <w:tc>
-          <w:tcPr>
-            <w:tcW w:type="dxa" w:w="4703"/>
-            <w:shd w:val="clear" w:color="auto" w:fill="1A5276"/>
-          </w:tcPr>
-          <w:p>
-            <w:r>
-              <w:rPr>
-                <w:b/>
-                <w:color w:val="FFFFFF"/>
-              </w:rPr>
-              <w:t>Discovered by</w:t>
-            </w:r>
-          </w:p>
-        </w:tc>
-        <w:tc>
-          <w:tcPr>
-            <w:tcW w:type="dxa" w:w="4703"/>
-          </w:tcPr>
-          <w:p>
-            <w:r>
-              <w:t>Reading addRecipeModal.js — ingredients are collected as DOM input values and stored as a string array in Firestore.</w:t>
-            </w:r>
-          </w:p>
-        </w:tc>
-      </w:tr>
-      <w:tr>
-        <w:tc>
-          <w:tcPr>
-            <w:tcW w:type="dxa" w:w="4703"/>
-            <w:shd w:val="clear" w:color="auto" w:fill="1E8B4C"/>
-          </w:tcPr>
-          <w:p>
-            <w:r>
-              <w:rPr>
-                <w:b/>
-                <w:color w:val="FFFFFF"/>
-              </w:rPr>
-              <w:t>Correction</w:t>
-            </w:r>
-          </w:p>
-        </w:tc>
-        <w:tc>
-          <w:tcPr>
-            <w:tcW w:type="dxa" w:w="4703"/>
-          </w:tcPr>
-          <w:p>
-            <w:r>
-              <w:t>filterBySearch() calls parseIngredients() before searching, handling both arrays and strings. TC-33-15 tests the string fallback.</w:t>
-            </w:r>
-          </w:p>
-        </w:tc>
-      </w:tr>
-    </w:tbl>
-    <w:p/>
-    <w:p>
-      <w:r>
-        <w:rPr>
-          <w:b/>
-          <w:color w:val="27AE60"/>
-          <w:sz w:val="24"/>
-        </w:rPr>
-        <w:t xml:space="preserve">  Error 7 — Like/Unlike Cannot Be Tested via HTTP</w:t>
-      </w:r>
-    </w:p>
-    <w:tbl>
-      <w:tblPr>
-        <w:tblStyle w:val="TableGrid"/>
-        <w:tblW w:type="auto" w:w="0"/>
-        <w:tblLook w:firstColumn="1" w:firstRow="1" w:lastColumn="0" w:lastRow="0" w:noHBand="0" w:noVBand="1" w:val="04A0"/>
-      </w:tblPr>
-      <w:tblGrid>
-        <w:gridCol w:w="4703"/>
-        <w:gridCol w:w="4703"/>
-      </w:tblGrid>
-      <w:tr>
-        <w:tc>
-          <w:tcPr>
-            <w:tcW w:type="dxa" w:w="4703"/>
-            <w:shd w:val="clear" w:color="auto" w:fill="C0392B"/>
-          </w:tcPr>
-          <w:p>
-            <w:r>
-              <w:rPr>
-                <w:b/>
-                <w:color w:val="FFFFFF"/>
-              </w:rPr>
-              <w:t>What happened</w:t>
-            </w:r>
-          </w:p>
-        </w:tc>
-        <w:tc>
-          <w:tcPr>
-            <w:tcW w:type="dxa" w:w="4703"/>
-          </w:tcPr>
-          <w:p>
-            <w:r>
-              <w:t>Initial plan was to test like/unlike via supertest HTTP calls like the prototype.</w:t>
-            </w:r>
-          </w:p>
-        </w:tc>
-      </w:tr>
-      <w:tr>
-        <w:tc>
-          <w:tcPr>
-            <w:tcW w:type="dxa" w:w="4703"/>
-            <w:shd w:val="clear" w:color="auto" w:fill="1A5276"/>
-          </w:tcPr>
-          <w:p>
-            <w:r>
-              <w:rPr>
-                <w:b/>
-                <w:color w:val="FFFFFF"/>
-              </w:rPr>
-              <w:t>Discovered by</w:t>
-            </w:r>
-          </w:p>
-        </w:tc>
-        <w:tc>
-          <w:tcPr>
-            <w:tcW w:type="dxa" w:w="4703"/>
-          </w:tcPr>
-          <w:p>
-            <w:r>
-              <w:t>Reading src/api/recipes.js — likeRecipe() calls setDoc() on Firestore directly. There is no REST API.</w:t>
-            </w:r>
-          </w:p>
-        </w:tc>
-      </w:tr>
-      <w:tr>
-        <w:tc>
-          <w:tcPr>
-            <w:tcW w:type="dxa" w:w="4703"/>
-            <w:shd w:val="clear" w:color="auto" w:fill="1E8B4C"/>
-          </w:tcPr>
-          <w:p>
-            <w:r>
-              <w:rPr>
-                <w:b/>
-                <w:color w:val="FFFFFF"/>
-              </w:rPr>
-              <w:t>Correction</w:t>
-            </w:r>
-          </w:p>
-        </w:tc>
-        <w:tc>
-          <w:tcPr>
-            <w:tcW w:type="dxa" w:w="4703"/>
-          </w:tcPr>
-          <w:p>
-            <w:r>
-              <w:t>FR-38 tests the client-side Set&lt;string&gt; state logic instead. Firestore writes are noted as requiring Firebase Emulator Suite.</w:t>
-            </w:r>
-          </w:p>
-        </w:tc>
-      </w:tr>
-    </w:tbl>
-    <w:p/>
-    <w:p>
-      <w:r>
-        <w:rPr>
-          <w:b/>
-          <w:color w:val="8E44AD"/>
-          <w:sz w:val="24"/>
-        </w:rPr>
-        <w:t xml:space="preserve">  Error 8 — FR-39 Add to Plan Is Not Implemented</w:t>
-      </w:r>
-    </w:p>
-    <w:tbl>
-      <w:tblPr>
-        <w:tblStyle w:val="TableGrid"/>
-        <w:tblW w:type="auto" w:w="0"/>
-        <w:tblLook w:firstColumn="1" w:firstRow="1" w:lastColumn="0" w:lastRow="0" w:noHBand="0" w:noVBand="1" w:val="04A0"/>
-      </w:tblPr>
-      <w:tblGrid>
-        <w:gridCol w:w="4703"/>
-        <w:gridCol w:w="4703"/>
-      </w:tblGrid>
-      <w:tr>
-        <w:tc>
-          <w:tcPr>
-            <w:tcW w:type="dxa" w:w="4703"/>
-            <w:shd w:val="clear" w:color="auto" w:fill="C0392B"/>
-          </w:tcPr>
-          <w:p>
-            <w:r>
-              <w:rPr>
-                <w:b/>
-                <w:color w:val="FFFFFF"/>
-              </w:rPr>
-              <w:t>What happened</w:t>
-            </w:r>
-          </w:p>
-        </w:tc>
-        <w:tc>
-          <w:tcPr>
-            <w:tcW w:type="dxa" w:w="4703"/>
-          </w:tcPr>
-          <w:p>
-            <w:r>
-              <w:t>Tests were being written for an "Add to Plan" button on each recipe card.</w:t>
-            </w:r>
-          </w:p>
-        </w:tc>
-      </w:tr>
-      <w:tr>
-        <w:tc>
-          <w:tcPr>
-            <w:tcW w:type="dxa" w:w="4703"/>
-            <w:shd w:val="clear" w:color="auto" w:fill="1A5276"/>
-          </w:tcPr>
-          <w:p>
-            <w:r>
-              <w:rPr>
-                <w:b/>
-                <w:color w:val="FFFFFF"/>
-              </w:rPr>
-              <w:t>Discovered by</w:t>
-            </w:r>
-          </w:p>
-        </w:tc>
-        <w:tc>
-          <w:tcPr>
-            <w:tcW w:type="dxa" w:w="4703"/>
-          </w:tcPr>
-          <w:p>
-            <w:r>
-              <w:t>Reading discover.js renderGrid() — cards only have a like/unlike button. No "Add to Plan" button exists.</w:t>
-            </w:r>
-          </w:p>
-        </w:tc>
-      </w:tr>
-      <w:tr>
-        <w:tc>
-          <w:tcPr>
-            <w:tcW w:type="dxa" w:w="4703"/>
-            <w:shd w:val="clear" w:color="auto" w:fill="1E8B4C"/>
-          </w:tcPr>
-          <w:p>
-            <w:r>
-              <w:rPr>
-                <w:b/>
-                <w:color w:val="FFFFFF"/>
-              </w:rPr>
-              <w:t>Correction</w:t>
-            </w:r>
-          </w:p>
-        </w:tc>
-        <w:tc>
-          <w:tcPr>
-            <w:tcW w:type="dxa" w:w="4703"/>
-          </w:tcPr>
-          <w:p>
-            <w:r>
-              <w:t>FR-39.test.js tests the validation logic that will be needed. A clear IMPLEMENTATION STATUS note was added at the top of the file.</w:t>
-            </w:r>
-          </w:p>
-        </w:tc>
-      </w:tr>
-    </w:tbl>
-    <w:p/>
-    <w:p>
-      <w:r>
-        <w:br w:type="page"/>
-      </w:r>
-    </w:p>
-    <w:p>
-      <w:pPr>
-        <w:pStyle w:val="Heading1"/>
-      </w:pPr>
-      <w:r>
-        <w:rPr>
-          <w:color w:val="8E44AD"/>
-        </w:rPr>
-        <w:t>3.  Key Findings About the App</w:t>
-      </w:r>
-    </w:p>
-    <w:p>
-      <w:r>
-        <w:rPr>
-          <w:b/>
-          <w:color w:val="8E44AD"/>
-          <w:sz w:val="24"/>
-        </w:rPr>
-        <w:t xml:space="preserve">  Finding 1 — Dietary Filter Not Connected</w:t>
-      </w:r>
-    </w:p>
-    <w:p>
-      <w:r>
-        <w:rPr>
-          <w:b w:val="0"/>
-          <w:sz w:val="22"/>
-        </w:rPr>
-        <w:t>filterAndRender() in discover.js filters by search, cuisine, and difficulty only. There is no dietary filter wired up in the Discover page UI, even though DIETARY_OPTIONS is fully defined, recipes store a dietary array, and FR-36 requires dietary filter chips.</w:t>
-      </w:r>
-    </w:p>
-    <w:p>
-      <w:r>
-        <w:rPr>
-          <w:b/>
-          <w:color w:val="8E44AD"/>
-        </w:rPr>
-        <w:t>Status: Feature gap — dietary filter chips are specified but not implemented in discover.js.</w:t>
-      </w:r>
-    </w:p>
-    <w:p/>
-    <w:p>
-      <w:r>
-        <w:rPr>
-          <w:b/>
-          <w:color w:val="E74C3C"/>
-          <w:sz w:val="24"/>
-        </w:rPr>
-        <w:t xml:space="preserve">  Finding 2 — Add to Plan Button Does Not Exist</w:t>
-      </w:r>
-    </w:p>
-    <w:p>
-      <w:r>
-        <w:rPr>
-          <w:b w:val="0"/>
-          <w:sz w:val="22"/>
-        </w:rPr>
-        <w:t>The story card requires an "Add to Plan" button on each recipe card (FR-39). The current renderGrid() function in discover.js does not include this button.</w:t>
-      </w:r>
-    </w:p>
-    <w:p>
-      <w:r>
-        <w:rPr>
-          <w:b/>
-          <w:color w:val="E74C3C"/>
-        </w:rPr>
-        <w:t>Status: Feature gap — needs to be implemented.</w:t>
-      </w:r>
-    </w:p>
-    <w:p/>
-    <w:p>
-      <w:r>
-        <w:rPr>
-          <w:b/>
-          <w:color w:val="E67E22"/>
-          <w:sz w:val="24"/>
-        </w:rPr>
-        <w:t xml:space="preserve">  Finding 3 — No Recipe-Level Like Count</w:t>
-      </w:r>
-    </w:p>
-    <w:p>
-      <w:r>
-        <w:rPr>
-          <w:b w:val="0"/>
-          <w:sz w:val="22"/>
-        </w:rPr>
-        <w:t>FR-32 states cards should show a "like count." The current implementation uses a likedIds Set to show whether the current user has liked a recipe, but no total like count exists on the recipe document. Likes are stored as users/{uid}/swipes/{recipeId} subcollections.</w:t>
-      </w:r>
-    </w:p>
-    <w:p>
-      <w:r>
-        <w:rPr>
-          <w:b/>
-          <w:color w:val="E67E22"/>
-        </w:rPr>
-        <w:t>Status: Displaying a total like count requires either a Firestore count() aggregation or a denormalized likeCount field.</w:t>
-      </w:r>
-    </w:p>
-    <w:p/>
-    <w:p>
-      <w:r>
-        <w:rPr>
-          <w:b/>
-          <w:color w:val="27AE60"/>
-          <w:sz w:val="24"/>
-        </w:rPr>
-        <w:t xml:space="preserve">  Finding 4 — Difficulty Uses a Dropdown, Not Chips</w:t>
-      </w:r>
-    </w:p>
-    <w:p>
-      <w:r>
-        <w:rPr>
-          <w:b w:val="0"/>
-          <w:sz w:val="22"/>
-        </w:rPr>
-        <w:t>FR-35 refers to "filter chips" for difficulty. discover.html uses a &lt;select&gt; dropdown (#difficultyFilter), not chip buttons.</w:t>
-      </w:r>
-    </w:p>
-    <w:p>
-      <w:r>
-        <w:rPr>
-          <w:b/>
-          <w:color w:val="27AE60"/>
-        </w:rPr>
-        <w:t>Status: Minor UI divergence from the spec — functions correctly but does not match the story wording.</w:t>
-      </w:r>
-    </w:p>
-    <w:p/>
-    <w:p>
-      <w:r>
-        <w:br w:type="page"/>
-      </w:r>
-    </w:p>
-    <w:p>
-      <w:pPr>
-        <w:pStyle w:val="Heading1"/>
-      </w:pPr>
-      <w:r>
-        <w:rPr>
-          <w:color w:val="2C3E50"/>
-        </w:rPr>
-        <w:t>4.  Full Test Run Output</w:t>
-      </w:r>
-    </w:p>
-    <w:p>
-      <w:r>
-        <w:rPr>
-          <w:b/>
-          <w:sz w:val="22"/>
-        </w:rPr>
-        <w:t>Command run:</w:t>
-      </w:r>
-    </w:p>
-    <w:p>
-      <w:pPr>
-        <w:spacing w:before="40" w:after="40"/>
-        <w:ind w:left="432"/>
-      </w:pPr>
-      <w:r>
-        <w:rPr>
-          <w:rFonts w:ascii="Courier New" w:hAnsi="Courier New"/>
-          <w:color w:val="1A1A2E"/>
-          <w:sz w:val="18"/>
-        </w:rPr>
-        <w:t>cd test_cases &amp;&amp; npm test</w:t>
-      </w:r>
-    </w:p>
-    <w:p/>
-    <w:p>
-      <w:r>
-        <w:rPr>
-          <w:b/>
-          <w:sz w:val="22"/>
-        </w:rPr>
-        <w:t>Summary output:</w:t>
-      </w:r>
-    </w:p>
-    <w:p>
-      <w:pPr>
-        <w:spacing w:before="40" w:after="40"/>
-        <w:ind w:left="432"/>
-      </w:pPr>
-      <w:r>
-        <w:rPr>
-          <w:rFonts w:ascii="Courier New" w:hAnsi="Courier New"/>
-          <w:color w:val="1A1A2E"/>
-          <w:sz w:val="18"/>
-        </w:rPr>
-        <w:t>RUN  v1.6.1  C:/Users/johann/OneDrive/Desktop/Tender/test_cases</w:t>
-      </w:r>
-    </w:p>
-    <w:p>
-      <w:pPr>
-        <w:spacing w:before="40" w:after="40"/>
-        <w:ind w:left="432"/>
-      </w:pPr>
-      <w:r>
-        <w:rPr>
-          <w:rFonts w:ascii="Courier New" w:hAnsi="Courier New"/>
-          <w:color w:val="1A1A2E"/>
-          <w:sz w:val="18"/>
-        </w:rPr>
-      </w:r>
-    </w:p>
-    <w:p>
-      <w:pPr>
-        <w:spacing w:before="40" w:after="40"/>
-        <w:ind w:left="432"/>
-      </w:pPr>
-      <w:r>
-        <w:rPr>
-          <w:rFonts w:ascii="Courier New" w:hAnsi="Courier New"/>
-          <w:color w:val="1A1A2E"/>
-          <w:sz w:val="18"/>
-        </w:rPr>
-        <w:t>Test Files  10 passed (10)</w:t>
-      </w:r>
-    </w:p>
-    <w:p>
-      <w:pPr>
-        <w:spacing w:before="40" w:after="40"/>
-        <w:ind w:left="432"/>
-      </w:pPr>
-      <w:r>
-        <w:rPr>
-          <w:rFonts w:ascii="Courier New" w:hAnsi="Courier New"/>
-          <w:color w:val="1A1A2E"/>
-          <w:sz w:val="18"/>
-        </w:rPr>
-        <w:t xml:space="preserve">      Tests  136 passed (136)</w:t>
-      </w:r>
-    </w:p>
-    <w:p>
-      <w:pPr>
-        <w:spacing w:before="40" w:after="40"/>
-        <w:ind w:left="432"/>
-      </w:pPr>
-      <w:r>
-        <w:rPr>
-          <w:rFonts w:ascii="Courier New" w:hAnsi="Courier New"/>
-          <w:color w:val="1A1A2E"/>
-          <w:sz w:val="18"/>
-        </w:rPr>
-        <w:t xml:space="preserve">   Start at  17:10:29</w:t>
-      </w:r>
-    </w:p>
-    <w:p>
-      <w:pPr>
-        <w:spacing w:before="40" w:after="40"/>
-        <w:ind w:left="432"/>
-      </w:pPr>
-      <w:r>
-        <w:rPr>
-          <w:rFonts w:ascii="Courier New" w:hAnsi="Courier New"/>
-          <w:color w:val="1A1A2E"/>
-          <w:sz w:val="18"/>
-        </w:rPr>
-        <w:t xml:space="preserve">   Duration  1.10s (transform 210ms, setup 0ms, collect 551ms,</w:t>
-      </w:r>
-    </w:p>
-    <w:p>
-      <w:pPr>
-        <w:spacing w:before="40" w:after="40"/>
-        <w:ind w:left="432"/>
-      </w:pPr>
-      <w:r>
-        <w:rPr>
-          <w:rFonts w:ascii="Courier New" w:hAnsi="Courier New"/>
-          <w:color w:val="1A1A2E"/>
-          <w:sz w:val="18"/>
-        </w:rPr>
-        <w:t xml:space="preserve">             tests 110ms, environment 3ms, prepare 4.09s)</w:t>
-      </w:r>
-    </w:p>
-    <w:p/>
-    <w:p>
-      <w:r>
-        <w:rPr>
-          <w:b/>
-          <w:color w:val="1E8B4C"/>
-          <w:sz w:val="28"/>
-        </w:rPr>
-        <w:t>All 136 tests passed. Zero failures. Zero errors.</w:t>
-      </w:r>
-    </w:p>
-    <w:p>
-      <w:r>
-        <w:br w:type="page"/>
-      </w:r>
-    </w:p>
-    <w:p>
-      <w:pPr>
-        <w:pStyle w:val="Heading1"/>
-      </w:pPr>
-      <w:r>
-        <w:rPr>
-          <w:color w:val="2C3E50"/>
-        </w:rPr>
-        <w:t>5.  Per-File Results</w:t>
-      </w:r>
-    </w:p>
-    <w:tbl>
-      <w:tblPr>
-        <w:tblStyle w:val="TableGrid"/>
-        <w:tblW w:type="auto" w:w="0"/>
-        <w:tblLook w:firstColumn="1" w:firstRow="1" w:lastColumn="0" w:lastRow="0" w:noHBand="0" w:noVBand="1" w:val="04A0"/>
-      </w:tblPr>
-      <w:tblGrid>
-        <w:gridCol w:w="1568"/>
-        <w:gridCol w:w="1568"/>
-        <w:gridCol w:w="1568"/>
-        <w:gridCol w:w="1568"/>
-        <w:gridCol w:w="1568"/>
-        <w:gridCol w:w="1568"/>
-      </w:tblGrid>
-      <w:tr>
-        <w:tc>
-          <w:tcPr>
-            <w:tcW w:type="dxa" w:w="1568"/>
-            <w:shd w:val="clear" w:color="auto" w:fill="2C3E50"/>
-          </w:tcPr>
-          <w:p>
-            <w:r>
-              <w:rPr>
-                <w:b/>
-                <w:color w:val="FFFFFF"/>
               </w:rPr>
               <w:t>File</w:t>
             </w:r>
@@ -2004,14 +836,12 @@
         </w:tc>
         <w:tc>
           <w:tcPr>
-            <w:tcW w:type="dxa" w:w="1568"/>
-            <w:shd w:val="clear" w:color="auto" w:fill="2C3E50"/>
+            <w:tcW w:type="dxa" w:w="1728"/>
           </w:tcPr>
           <w:p>
             <w:r>
               <w:rPr>
                 <w:b/>
-                <w:color w:val="FFFFFF"/>
               </w:rPr>
               <w:t>Requirement</w:t>
             </w:r>
@@ -2019,14 +849,12 @@
         </w:tc>
         <w:tc>
           <w:tcPr>
-            <w:tcW w:type="dxa" w:w="1568"/>
-            <w:shd w:val="clear" w:color="auto" w:fill="2C3E50"/>
+            <w:tcW w:type="dxa" w:w="1728"/>
           </w:tcPr>
           <w:p>
             <w:r>
               <w:rPr>
                 <w:b/>
-                <w:color w:val="FFFFFF"/>
               </w:rPr>
               <w:t>Tests</w:t>
             </w:r>
@@ -2034,14 +862,12 @@
         </w:tc>
         <w:tc>
           <w:tcPr>
-            <w:tcW w:type="dxa" w:w="1568"/>
-            <w:shd w:val="clear" w:color="auto" w:fill="2C3E50"/>
+            <w:tcW w:type="dxa" w:w="1728"/>
           </w:tcPr>
           <w:p>
             <w:r>
               <w:rPr>
                 <w:b/>
-                <w:color w:val="FFFFFF"/>
               </w:rPr>
               <w:t>Pass</w:t>
             </w:r>
@@ -2049,29 +875,12 @@
         </w:tc>
         <w:tc>
           <w:tcPr>
-            <w:tcW w:type="dxa" w:w="1568"/>
-            <w:shd w:val="clear" w:color="auto" w:fill="2C3E50"/>
+            <w:tcW w:type="dxa" w:w="1728"/>
           </w:tcPr>
           <w:p>
             <w:r>
               <w:rPr>
                 <w:b/>
-                <w:color w:val="FFFFFF"/>
-              </w:rPr>
-              <w:t>Fail</w:t>
-            </w:r>
-          </w:p>
-        </w:tc>
-        <w:tc>
-          <w:tcPr>
-            <w:tcW w:type="dxa" w:w="1568"/>
-            <w:shd w:val="clear" w:color="auto" w:fill="2C3E50"/>
-          </w:tcPr>
-          <w:p>
-            <w:r>
-              <w:rPr>
-                <w:b/>
-                <w:color w:val="FFFFFF"/>
               </w:rPr>
               <w:t>Notes</w:t>
             </w:r>
@@ -2081,8 +890,7 @@
       <w:tr>
         <w:tc>
           <w:tcPr>
-            <w:tcW w:type="dxa" w:w="1568"/>
-            <w:shd w:val="clear" w:color="auto" w:fill="FFFFFF"/>
+            <w:tcW w:type="dxa" w:w="1728"/>
           </w:tcPr>
           <w:p>
             <w:r>
@@ -2092,19 +900,17 @@
         </w:tc>
         <w:tc>
           <w:tcPr>
-            <w:tcW w:type="dxa" w:w="1568"/>
-            <w:shd w:val="clear" w:color="auto" w:fill="FFFFFF"/>
+            <w:tcW w:type="dxa" w:w="1728"/>
           </w:tcPr>
           <w:p>
             <w:r>
-              <w:t>Recipe grid shown</w:t>
+              <w:t>Recipe grid</w:t>
             </w:r>
           </w:p>
         </w:tc>
         <w:tc>
           <w:tcPr>
-            <w:tcW w:type="dxa" w:w="1568"/>
-            <w:shd w:val="clear" w:color="auto" w:fill="FFFFFF"/>
+            <w:tcW w:type="dxa" w:w="1728"/>
           </w:tcPr>
           <w:p>
             <w:r>
@@ -2114,33 +920,17 @@
         </w:tc>
         <w:tc>
           <w:tcPr>
-            <w:tcW w:type="dxa" w:w="1568"/>
-            <w:shd w:val="clear" w:color="auto" w:fill="FFFFFF"/>
+            <w:tcW w:type="dxa" w:w="1728"/>
           </w:tcPr>
           <w:p>
             <w:r>
-              <w:rPr>
-                <w:color w:val="1E8B4C"/>
-              </w:rPr>
               <w:t>7</w:t>
             </w:r>
           </w:p>
         </w:tc>
         <w:tc>
           <w:tcPr>
-            <w:tcW w:type="dxa" w:w="1568"/>
-            <w:shd w:val="clear" w:color="auto" w:fill="FFFFFF"/>
-          </w:tcPr>
-          <w:p>
-            <w:r>
-              <w:t>0</w:t>
-            </w:r>
-          </w:p>
-        </w:tc>
-        <w:tc>
-          <w:tcPr>
-            <w:tcW w:type="dxa" w:w="1568"/>
-            <w:shd w:val="clear" w:color="auto" w:fill="FFFFFF"/>
+            <w:tcW w:type="dxa" w:w="1728"/>
           </w:tcPr>
           <w:p>
             <w:r/>
@@ -2150,8 +940,7 @@
       <w:tr>
         <w:tc>
           <w:tcPr>
-            <w:tcW w:type="dxa" w:w="1568"/>
-            <w:shd w:val="clear" w:color="auto" w:fill="F8F9FA"/>
+            <w:tcW w:type="dxa" w:w="1728"/>
           </w:tcPr>
           <w:p>
             <w:r>
@@ -2161,8 +950,7 @@
         </w:tc>
         <w:tc>
           <w:tcPr>
-            <w:tcW w:type="dxa" w:w="1568"/>
-            <w:shd w:val="clear" w:color="auto" w:fill="F8F9FA"/>
+            <w:tcW w:type="dxa" w:w="1728"/>
           </w:tcPr>
           <w:p>
             <w:r>
@@ -2172,8 +960,7 @@
         </w:tc>
         <w:tc>
           <w:tcPr>
-            <w:tcW w:type="dxa" w:w="1568"/>
-            <w:shd w:val="clear" w:color="auto" w:fill="F8F9FA"/>
+            <w:tcW w:type="dxa" w:w="1728"/>
           </w:tcPr>
           <w:p>
             <w:r>
@@ -2183,33 +970,17 @@
         </w:tc>
         <w:tc>
           <w:tcPr>
-            <w:tcW w:type="dxa" w:w="1568"/>
-            <w:shd w:val="clear" w:color="auto" w:fill="F8F9FA"/>
+            <w:tcW w:type="dxa" w:w="1728"/>
           </w:tcPr>
           <w:p>
             <w:r>
-              <w:rPr>
-                <w:color w:val="1E8B4C"/>
-              </w:rPr>
               <w:t>14</w:t>
             </w:r>
           </w:p>
         </w:tc>
         <w:tc>
           <w:tcPr>
-            <w:tcW w:type="dxa" w:w="1568"/>
-            <w:shd w:val="clear" w:color="auto" w:fill="F8F9FA"/>
-          </w:tcPr>
-          <w:p>
-            <w:r>
-              <w:t>0</w:t>
-            </w:r>
-          </w:p>
-        </w:tc>
-        <w:tc>
-          <w:tcPr>
-            <w:tcW w:type="dxa" w:w="1568"/>
-            <w:shd w:val="clear" w:color="auto" w:fill="F8F9FA"/>
+            <w:tcW w:type="dxa" w:w="1728"/>
           </w:tcPr>
           <w:p>
             <w:r>
@@ -2221,8 +992,7 @@
       <w:tr>
         <w:tc>
           <w:tcPr>
-            <w:tcW w:type="dxa" w:w="1568"/>
-            <w:shd w:val="clear" w:color="auto" w:fill="FFFFFF"/>
+            <w:tcW w:type="dxa" w:w="1728"/>
           </w:tcPr>
           <w:p>
             <w:r>
@@ -2232,19 +1002,17 @@
         </w:tc>
         <w:tc>
           <w:tcPr>
-            <w:tcW w:type="dxa" w:w="1568"/>
-            <w:shd w:val="clear" w:color="auto" w:fill="FFFFFF"/>
+            <w:tcW w:type="dxa" w:w="1728"/>
           </w:tcPr>
           <w:p>
             <w:r>
-              <w:t>Text search filter</w:t>
+              <w:t>Text search</w:t>
             </w:r>
           </w:p>
         </w:tc>
         <w:tc>
           <w:tcPr>
-            <w:tcW w:type="dxa" w:w="1568"/>
-            <w:shd w:val="clear" w:color="auto" w:fill="FFFFFF"/>
+            <w:tcW w:type="dxa" w:w="1728"/>
           </w:tcPr>
           <w:p>
             <w:r>
@@ -2254,37 +1022,21 @@
         </w:tc>
         <w:tc>
           <w:tcPr>
-            <w:tcW w:type="dxa" w:w="1568"/>
-            <w:shd w:val="clear" w:color="auto" w:fill="FFFFFF"/>
+            <w:tcW w:type="dxa" w:w="1728"/>
           </w:tcPr>
           <w:p>
             <w:r>
-              <w:rPr>
-                <w:color w:val="1E8B4C"/>
-              </w:rPr>
               <w:t>15</w:t>
             </w:r>
           </w:p>
         </w:tc>
         <w:tc>
           <w:tcPr>
-            <w:tcW w:type="dxa" w:w="1568"/>
-            <w:shd w:val="clear" w:color="auto" w:fill="FFFFFF"/>
+            <w:tcW w:type="dxa" w:w="1728"/>
           </w:tcPr>
           <w:p>
             <w:r>
-              <w:t>0</w:t>
-            </w:r>
-          </w:p>
-        </w:tc>
-        <w:tc>
-          <w:tcPr>
-            <w:tcW w:type="dxa" w:w="1568"/>
-            <w:shd w:val="clear" w:color="auto" w:fill="FFFFFF"/>
-          </w:tcPr>
-          <w:p>
-            <w:r>
-              <w:t>Also searches ingredients</w:t>
+              <w:t>name+desc+ingredients</w:t>
             </w:r>
           </w:p>
         </w:tc>
@@ -2292,8 +1044,7 @@
       <w:tr>
         <w:tc>
           <w:tcPr>
-            <w:tcW w:type="dxa" w:w="1568"/>
-            <w:shd w:val="clear" w:color="auto" w:fill="F8F9FA"/>
+            <w:tcW w:type="dxa" w:w="1728"/>
           </w:tcPr>
           <w:p>
             <w:r>
@@ -2303,8 +1054,7 @@
         </w:tc>
         <w:tc>
           <w:tcPr>
-            <w:tcW w:type="dxa" w:w="1568"/>
-            <w:shd w:val="clear" w:color="auto" w:fill="F8F9FA"/>
+            <w:tcW w:type="dxa" w:w="1728"/>
           </w:tcPr>
           <w:p>
             <w:r>
@@ -2314,8 +1064,7 @@
         </w:tc>
         <w:tc>
           <w:tcPr>
-            <w:tcW w:type="dxa" w:w="1568"/>
-            <w:shd w:val="clear" w:color="auto" w:fill="F8F9FA"/>
+            <w:tcW w:type="dxa" w:w="1728"/>
           </w:tcPr>
           <w:p>
             <w:r>
@@ -2325,37 +1074,21 @@
         </w:tc>
         <w:tc>
           <w:tcPr>
-            <w:tcW w:type="dxa" w:w="1568"/>
-            <w:shd w:val="clear" w:color="auto" w:fill="F8F9FA"/>
+            <w:tcW w:type="dxa" w:w="1728"/>
           </w:tcPr>
           <w:p>
             <w:r>
-              <w:rPr>
-                <w:color w:val="1E8B4C"/>
-              </w:rPr>
               <w:t>12</w:t>
             </w:r>
           </w:p>
         </w:tc>
         <w:tc>
           <w:tcPr>
-            <w:tcW w:type="dxa" w:w="1568"/>
-            <w:shd w:val="clear" w:color="auto" w:fill="F8F9FA"/>
+            <w:tcW w:type="dxa" w:w="1728"/>
           </w:tcPr>
           <w:p>
             <w:r>
-              <w:t>0</w:t>
-            </w:r>
-          </w:p>
-        </w:tc>
-        <w:tc>
-          <w:tcPr>
-            <w:tcW w:type="dxa" w:w="1568"/>
-            <w:shd w:val="clear" w:color="auto" w:fill="F8F9FA"/>
-          </w:tcPr>
-          <w:p>
-            <w:r>
-              <w:t>Strict equality, lowercase</w:t>
+              <w:t>strict equality, lowercase</w:t>
             </w:r>
           </w:p>
         </w:tc>
@@ -2363,8 +1096,7 @@
       <w:tr>
         <w:tc>
           <w:tcPr>
-            <w:tcW w:type="dxa" w:w="1568"/>
-            <w:shd w:val="clear" w:color="auto" w:fill="FFFFFF"/>
+            <w:tcW w:type="dxa" w:w="1728"/>
           </w:tcPr>
           <w:p>
             <w:r>
@@ -2374,19 +1106,17 @@
         </w:tc>
         <w:tc>
           <w:tcPr>
-            <w:tcW w:type="dxa" w:w="1568"/>
-            <w:shd w:val="clear" w:color="auto" w:fill="FFFFFF"/>
+            <w:tcW w:type="dxa" w:w="1728"/>
           </w:tcPr>
           <w:p>
             <w:r>
-              <w:t>Difficulty filter</w:t>
+              <w:t>Difficulty chips</w:t>
             </w:r>
           </w:p>
         </w:tc>
         <w:tc>
           <w:tcPr>
-            <w:tcW w:type="dxa" w:w="1568"/>
-            <w:shd w:val="clear" w:color="auto" w:fill="FFFFFF"/>
+            <w:tcW w:type="dxa" w:w="1728"/>
           </w:tcPr>
           <w:p>
             <w:r>
@@ -2396,37 +1126,21 @@
         </w:tc>
         <w:tc>
           <w:tcPr>
-            <w:tcW w:type="dxa" w:w="1568"/>
-            <w:shd w:val="clear" w:color="auto" w:fill="FFFFFF"/>
+            <w:tcW w:type="dxa" w:w="1728"/>
           </w:tcPr>
           <w:p>
             <w:r>
-              <w:rPr>
-                <w:color w:val="1E8B4C"/>
-              </w:rPr>
               <w:t>12</w:t>
             </w:r>
           </w:p>
         </w:tc>
         <w:tc>
           <w:tcPr>
-            <w:tcW w:type="dxa" w:w="1568"/>
-            <w:shd w:val="clear" w:color="auto" w:fill="FFFFFF"/>
+            <w:tcW w:type="dxa" w:w="1728"/>
           </w:tcPr>
           <w:p>
             <w:r>
-              <w:t>0</w:t>
-            </w:r>
-          </w:p>
-        </w:tc>
-        <w:tc>
-          <w:tcPr>
-            <w:tcW w:type="dxa" w:w="1568"/>
-            <w:shd w:val="clear" w:color="auto" w:fill="FFFFFF"/>
-          </w:tcPr>
-          <w:p>
-            <w:r>
-              <w:t>Lowercase values only</w:t>
+              <w:t>Fix 4: now chips</w:t>
             </w:r>
           </w:p>
         </w:tc>
@@ -2434,8 +1148,7 @@
       <w:tr>
         <w:tc>
           <w:tcPr>
-            <w:tcW w:type="dxa" w:w="1568"/>
-            <w:shd w:val="clear" w:color="auto" w:fill="F8F9FA"/>
+            <w:tcW w:type="dxa" w:w="1728"/>
           </w:tcPr>
           <w:p>
             <w:r>
@@ -2445,8 +1158,7 @@
         </w:tc>
         <w:tc>
           <w:tcPr>
-            <w:tcW w:type="dxa" w:w="1568"/>
-            <w:shd w:val="clear" w:color="auto" w:fill="F8F9FA"/>
+            <w:tcW w:type="dxa" w:w="1728"/>
           </w:tcPr>
           <w:p>
             <w:r>
@@ -2456,8 +1168,7 @@
         </w:tc>
         <w:tc>
           <w:tcPr>
-            <w:tcW w:type="dxa" w:w="1568"/>
-            <w:shd w:val="clear" w:color="auto" w:fill="F8F9FA"/>
+            <w:tcW w:type="dxa" w:w="1728"/>
           </w:tcPr>
           <w:p>
             <w:r>
@@ -2467,37 +1178,21 @@
         </w:tc>
         <w:tc>
           <w:tcPr>
-            <w:tcW w:type="dxa" w:w="1568"/>
-            <w:shd w:val="clear" w:color="auto" w:fill="F8F9FA"/>
+            <w:tcW w:type="dxa" w:w="1728"/>
           </w:tcPr>
           <w:p>
             <w:r>
-              <w:rPr>
-                <w:color w:val="1E8B4C"/>
-              </w:rPr>
               <w:t>13</w:t>
             </w:r>
           </w:p>
         </w:tc>
         <w:tc>
           <w:tcPr>
-            <w:tcW w:type="dxa" w:w="1568"/>
-            <w:shd w:val="clear" w:color="auto" w:fill="F8F9FA"/>
+            <w:tcW w:type="dxa" w:w="1728"/>
           </w:tcPr>
           <w:p>
             <w:r>
-              <w:t>0</w:t>
-            </w:r>
-          </w:p>
-        </w:tc>
-        <w:tc>
-          <w:tcPr>
-            <w:tcW w:type="dxa" w:w="1568"/>
-            <w:shd w:val="clear" w:color="auto" w:fill="F8F9FA"/>
-          </w:tcPr>
-          <w:p>
-            <w:r>
-              <w:t>UI not yet wired</w:t>
+              <w:t>Fix 1: dietary wired</w:t>
             </w:r>
           </w:p>
         </w:tc>
@@ -2505,8 +1200,7 @@
       <w:tr>
         <w:tc>
           <w:tcPr>
-            <w:tcW w:type="dxa" w:w="1568"/>
-            <w:shd w:val="clear" w:color="auto" w:fill="FFFFFF"/>
+            <w:tcW w:type="dxa" w:w="1728"/>
           </w:tcPr>
           <w:p>
             <w:r>
@@ -2516,8 +1210,7 @@
         </w:tc>
         <w:tc>
           <w:tcPr>
-            <w:tcW w:type="dxa" w:w="1568"/>
-            <w:shd w:val="clear" w:color="auto" w:fill="FFFFFF"/>
+            <w:tcW w:type="dxa" w:w="1728"/>
           </w:tcPr>
           <w:p>
             <w:r>
@@ -2527,8 +1220,7 @@
         </w:tc>
         <w:tc>
           <w:tcPr>
-            <w:tcW w:type="dxa" w:w="1568"/>
-            <w:shd w:val="clear" w:color="auto" w:fill="FFFFFF"/>
+            <w:tcW w:type="dxa" w:w="1728"/>
           </w:tcPr>
           <w:p>
             <w:r>
@@ -2538,33 +1230,17 @@
         </w:tc>
         <w:tc>
           <w:tcPr>
-            <w:tcW w:type="dxa" w:w="1568"/>
-            <w:shd w:val="clear" w:color="auto" w:fill="FFFFFF"/>
+            <w:tcW w:type="dxa" w:w="1728"/>
           </w:tcPr>
           <w:p>
             <w:r>
-              <w:rPr>
-                <w:color w:val="1E8B4C"/>
-              </w:rPr>
               <w:t>16</w:t>
             </w:r>
           </w:p>
         </w:tc>
         <w:tc>
           <w:tcPr>
-            <w:tcW w:type="dxa" w:w="1568"/>
-            <w:shd w:val="clear" w:color="auto" w:fill="FFFFFF"/>
-          </w:tcPr>
-          <w:p>
-            <w:r>
-              <w:t>0</w:t>
-            </w:r>
-          </w:p>
-        </w:tc>
-        <w:tc>
-          <w:tcPr>
-            <w:tcW w:type="dxa" w:w="1568"/>
-            <w:shd w:val="clear" w:color="auto" w:fill="FFFFFF"/>
+            <w:tcW w:type="dxa" w:w="1728"/>
           </w:tcPr>
           <w:p>
             <w:r/>
@@ -2574,8 +1250,7 @@
       <w:tr>
         <w:tc>
           <w:tcPr>
-            <w:tcW w:type="dxa" w:w="1568"/>
-            <w:shd w:val="clear" w:color="auto" w:fill="F8F9FA"/>
+            <w:tcW w:type="dxa" w:w="1728"/>
           </w:tcPr>
           <w:p>
             <w:r>
@@ -2585,59 +1260,41 @@
         </w:tc>
         <w:tc>
           <w:tcPr>
-            <w:tcW w:type="dxa" w:w="1568"/>
-            <w:shd w:val="clear" w:color="auto" w:fill="F8F9FA"/>
+            <w:tcW w:type="dxa" w:w="1728"/>
           </w:tcPr>
           <w:p>
             <w:r>
-              <w:t>Like / unlike button</w:t>
+              <w:t>Like/unlike + count</w:t>
             </w:r>
           </w:p>
         </w:tc>
         <w:tc>
           <w:tcPr>
-            <w:tcW w:type="dxa" w:w="1568"/>
-            <w:shd w:val="clear" w:color="auto" w:fill="F8F9FA"/>
+            <w:tcW w:type="dxa" w:w="1728"/>
           </w:tcPr>
           <w:p>
             <w:r>
-              <w:t>15</w:t>
+              <w:t>20</w:t>
             </w:r>
           </w:p>
         </w:tc>
         <w:tc>
           <w:tcPr>
-            <w:tcW w:type="dxa" w:w="1568"/>
-            <w:shd w:val="clear" w:color="auto" w:fill="F8F9FA"/>
+            <w:tcW w:type="dxa" w:w="1728"/>
           </w:tcPr>
           <w:p>
             <w:r>
-              <w:rPr>
-                <w:color w:val="1E8B4C"/>
-              </w:rPr>
-              <w:t>15</w:t>
+              <w:t>20</w:t>
             </w:r>
           </w:p>
         </w:tc>
         <w:tc>
           <w:tcPr>
-            <w:tcW w:type="dxa" w:w="1568"/>
-            <w:shd w:val="clear" w:color="auto" w:fill="F8F9FA"/>
+            <w:tcW w:type="dxa" w:w="1728"/>
           </w:tcPr>
           <w:p>
             <w:r>
-              <w:t>0</w:t>
-            </w:r>
-          </w:p>
-        </w:tc>
-        <w:tc>
-          <w:tcPr>
-            <w:tcW w:type="dxa" w:w="1568"/>
-            <w:shd w:val="clear" w:color="auto" w:fill="F8F9FA"/>
-          </w:tcPr>
-          <w:p>
-            <w:r>
-              <w:t>State logic, no Firestore</w:t>
+              <w:t>Fix 3: 5 new tests</w:t>
             </w:r>
           </w:p>
         </w:tc>
@@ -2645,8 +1302,7 @@
       <w:tr>
         <w:tc>
           <w:tcPr>
-            <w:tcW w:type="dxa" w:w="1568"/>
-            <w:shd w:val="clear" w:color="auto" w:fill="FFFFFF"/>
+            <w:tcW w:type="dxa" w:w="1728"/>
           </w:tcPr>
           <w:p>
             <w:r>
@@ -2656,19 +1312,17 @@
         </w:tc>
         <w:tc>
           <w:tcPr>
-            <w:tcW w:type="dxa" w:w="1568"/>
-            <w:shd w:val="clear" w:color="auto" w:fill="FFFFFF"/>
+            <w:tcW w:type="dxa" w:w="1728"/>
           </w:tcPr>
           <w:p>
             <w:r>
-              <w:t>Add to Plan button</w:t>
+              <w:t>Add to Plan</w:t>
             </w:r>
           </w:p>
         </w:tc>
         <w:tc>
           <w:tcPr>
-            <w:tcW w:type="dxa" w:w="1568"/>
-            <w:shd w:val="clear" w:color="auto" w:fill="FFFFFF"/>
+            <w:tcW w:type="dxa" w:w="1728"/>
           </w:tcPr>
           <w:p>
             <w:r>
@@ -2678,37 +1332,21 @@
         </w:tc>
         <w:tc>
           <w:tcPr>
-            <w:tcW w:type="dxa" w:w="1568"/>
-            <w:shd w:val="clear" w:color="auto" w:fill="FFFFFF"/>
+            <w:tcW w:type="dxa" w:w="1728"/>
           </w:tcPr>
           <w:p>
             <w:r>
-              <w:rPr>
-                <w:color w:val="1E8B4C"/>
-              </w:rPr>
               <w:t>12</w:t>
             </w:r>
           </w:p>
         </w:tc>
         <w:tc>
           <w:tcPr>
-            <w:tcW w:type="dxa" w:w="1568"/>
-            <w:shd w:val="clear" w:color="auto" w:fill="FFFFFF"/>
+            <w:tcW w:type="dxa" w:w="1728"/>
           </w:tcPr>
           <w:p>
             <w:r>
-              <w:t>0</w:t>
-            </w:r>
-          </w:p>
-        </w:tc>
-        <w:tc>
-          <w:tcPr>
-            <w:tcW w:type="dxa" w:w="1568"/>
-            <w:shd w:val="clear" w:color="auto" w:fill="FFFFFF"/>
-          </w:tcPr>
-          <w:p>
-            <w:r>
-              <w:t>Feature not implemented</w:t>
+              <w:t>Fix 2: implemented</w:t>
             </w:r>
           </w:p>
         </w:tc>
@@ -2716,8 +1354,7 @@
       <w:tr>
         <w:tc>
           <w:tcPr>
-            <w:tcW w:type="dxa" w:w="1568"/>
-            <w:shd w:val="clear" w:color="auto" w:fill="F8F9FA"/>
+            <w:tcW w:type="dxa" w:w="1728"/>
           </w:tcPr>
           <w:p>
             <w:r>
@@ -2727,8 +1364,7 @@
         </w:tc>
         <w:tc>
           <w:tcPr>
-            <w:tcW w:type="dxa" w:w="1568"/>
-            <w:shd w:val="clear" w:color="auto" w:fill="F8F9FA"/>
+            <w:tcW w:type="dxa" w:w="1728"/>
           </w:tcPr>
           <w:p>
             <w:r>
@@ -2738,8 +1374,7 @@
         </w:tc>
         <w:tc>
           <w:tcPr>
-            <w:tcW w:type="dxa" w:w="1568"/>
-            <w:shd w:val="clear" w:color="auto" w:fill="F8F9FA"/>
+            <w:tcW w:type="dxa" w:w="1728"/>
           </w:tcPr>
           <w:p>
             <w:r>
@@ -2749,37 +1384,21 @@
         </w:tc>
         <w:tc>
           <w:tcPr>
-            <w:tcW w:type="dxa" w:w="1568"/>
-            <w:shd w:val="clear" w:color="auto" w:fill="F8F9FA"/>
+            <w:tcW w:type="dxa" w:w="1728"/>
           </w:tcPr>
           <w:p>
             <w:r>
-              <w:rPr>
-                <w:color w:val="1E8B4C"/>
-              </w:rPr>
               <w:t>20</w:t>
             </w:r>
           </w:p>
         </w:tc>
         <w:tc>
           <w:tcPr>
-            <w:tcW w:type="dxa" w:w="1568"/>
-            <w:shd w:val="clear" w:color="auto" w:fill="F8F9FA"/>
+            <w:tcW w:type="dxa" w:w="1728"/>
           </w:tcPr>
           <w:p>
             <w:r>
-              <w:t>0</w:t>
-            </w:r>
-          </w:p>
-        </w:tc>
-        <w:tc>
-          <w:tcPr>
-            <w:tcW w:type="dxa" w:w="1568"/>
-            <w:shd w:val="clear" w:color="auto" w:fill="F8F9FA"/>
-          </w:tcPr>
-          <w:p>
-            <w:r>
-              <w:t>Only name required</w:t>
+              <w:t>only name required</w:t>
             </w:r>
           </w:p>
         </w:tc>
@@ -2787,102 +1406,140 @@
       <w:tr>
         <w:tc>
           <w:tcPr>
-            <w:tcW w:type="dxa" w:w="1568"/>
-            <w:shd w:val="clear" w:color="auto" w:fill="D5F5E3"/>
+            <w:tcW w:type="dxa" w:w="1728"/>
           </w:tcPr>
           <w:p>
             <w:r>
-              <w:rPr>
-                <w:b/>
-              </w:rPr>
               <w:t>TOTAL</w:t>
             </w:r>
           </w:p>
         </w:tc>
         <w:tc>
           <w:tcPr>
-            <w:tcW w:type="dxa" w:w="1568"/>
-            <w:shd w:val="clear" w:color="auto" w:fill="D5F5E3"/>
+            <w:tcW w:type="dxa" w:w="1728"/>
+          </w:tcPr>
+          <w:p>
+            <w:r/>
+          </w:p>
+        </w:tc>
+        <w:tc>
+          <w:tcPr>
+            <w:tcW w:type="dxa" w:w="1728"/>
           </w:tcPr>
           <w:p>
             <w:r>
-              <w:rPr>
-                <w:b/>
-              </w:rPr>
+              <w:t>141</w:t>
             </w:r>
           </w:p>
         </w:tc>
         <w:tc>
           <w:tcPr>
-            <w:tcW w:type="dxa" w:w="1568"/>
-            <w:shd w:val="clear" w:color="auto" w:fill="D5F5E3"/>
+            <w:tcW w:type="dxa" w:w="1728"/>
           </w:tcPr>
           <w:p>
             <w:r>
-              <w:rPr>
-                <w:b/>
-              </w:rPr>
-              <w:t>136</w:t>
+              <w:t>141</w:t>
             </w:r>
           </w:p>
         </w:tc>
         <w:tc>
           <w:tcPr>
-            <w:tcW w:type="dxa" w:w="1568"/>
-            <w:shd w:val="clear" w:color="auto" w:fill="D5F5E3"/>
+            <w:tcW w:type="dxa" w:w="1728"/>
           </w:tcPr>
           <w:p>
             <w:r>
-              <w:rPr>
-                <w:b/>
-              </w:rPr>
-              <w:t>136</w:t>
-            </w:r>
-          </w:p>
-        </w:tc>
-        <w:tc>
-          <w:tcPr>
-            <w:tcW w:type="dxa" w:w="1568"/>
-            <w:shd w:val="clear" w:color="auto" w:fill="D5F5E3"/>
-          </w:tcPr>
-          <w:p>
-            <w:r>
-              <w:rPr>
-                <w:b/>
-              </w:rPr>
-              <w:t>0</w:t>
-            </w:r>
-          </w:p>
-        </w:tc>
-        <w:tc>
-          <w:tcPr>
-            <w:tcW w:type="dxa" w:w="1568"/>
-            <w:shd w:val="clear" w:color="auto" w:fill="D5F5E3"/>
-          </w:tcPr>
-          <w:p>
-            <w:r>
-              <w:rPr>
-                <w:b/>
-              </w:rPr>
+              <w:t>0 failures</w:t>
             </w:r>
           </w:p>
         </w:tc>
       </w:tr>
     </w:tbl>
     <w:p>
+      <w:pPr>
+        <w:pStyle w:val="Heading2"/>
+      </w:pPr>
       <w:r>
-        <w:br w:type="page"/>
+        <w:t>7. What Tests Cannot Cover (Yet)</w:t>
       </w:r>
     </w:p>
     <w:p>
       <w:pPr>
-        <w:pStyle w:val="Heading1"/>
+        <w:pStyle w:val="ListBullet"/>
       </w:pPr>
       <w:r>
-        <w:rPr>
-          <w:color w:val="2C3E50"/>
-        </w:rPr>
-        <w:t>6.  What These Tests Cannot Cover (Yet)</w:t>
+        <w:t>Firestore reads: getAllRecipes(), getLikedRecipeIds() — require Firebase Emulator</w:t>
+      </w:r>
+    </w:p>
+    <w:p>
+      <w:pPr>
+        <w:pStyle w:val="ListBullet"/>
+      </w:pPr>
+      <w:r>
+        <w:t>likeRecipe() swipe doc + likeCount increment — require Firebase Emulator</w:t>
+      </w:r>
+    </w:p>
+    <w:p>
+      <w:pPr>
+        <w:pStyle w:val="ListBullet"/>
+      </w:pPr>
+      <w:r>
+        <w:t>unlikeRecipe() delete swipe + likeCount decrement — require Firebase Emulator</w:t>
+      </w:r>
+    </w:p>
+    <w:p>
+      <w:pPr>
+        <w:pStyle w:val="ListBullet"/>
+      </w:pPr>
+      <w:r>
+        <w:t>addMealPlanEntry() writes to users/{uid}/mealplan/ — require Firebase Emulator</w:t>
+      </w:r>
+    </w:p>
+    <w:p>
+      <w:pPr>
+        <w:pStyle w:val="ListBullet"/>
+      </w:pPr>
+      <w:r>
+        <w:t>requireAuth() uses Firebase Auth onAuthStateChanged — require Firebase Emulator</w:t>
+      </w:r>
+    </w:p>
+    <w:p>
+      <w:pPr>
+        <w:pStyle w:val="ListBullet"/>
+      </w:pPr>
+      <w:r>
+        <w:t>Browser: dietary chip click triggers grid re-render — require Playwright</w:t>
+      </w:r>
+    </w:p>
+    <w:p>
+      <w:pPr>
+        <w:pStyle w:val="ListBullet"/>
+      </w:pPr>
+      <w:r>
+        <w:t>Browser: difficulty chip click triggers grid re-render — require Playwright</w:t>
+      </w:r>
+    </w:p>
+    <w:p>
+      <w:pPr>
+        <w:pStyle w:val="ListBullet"/>
+      </w:pPr>
+      <w:r>
+        <w:t>Browser: Plan modal opens, day+meal selected, entry saved — require Playwright</w:t>
+      </w:r>
+    </w:p>
+    <w:p>
+      <w:pPr>
+        <w:pStyle w:val="ListBullet"/>
+      </w:pPr>
+      <w:r>
+        <w:t>Browser: like count updates on card without page reload — require Playwright</w:t>
+      </w:r>
+    </w:p>
+    <w:p>
+      <w:pPr>
+        <w:pStyle w:val="ListBullet"/>
+      </w:pPr>
+      <w:r>
+        <w:t>Browser: full like/unlike flow with toast messages — require Playwright</w:t>
       </w:r>
     </w:p>
     <w:p>
@@ -2890,724 +1547,54 @@
         <w:pStyle w:val="Heading2"/>
       </w:pPr>
       <w:r>
-        <w:rPr>
-          <w:color w:val="E67E22"/>
-        </w:rPr>
-        <w:t>Requires Firebase Emulator Suite</w:t>
-      </w:r>
-    </w:p>
-    <w:tbl>
-      <w:tblPr>
-        <w:tblStyle w:val="TableGrid"/>
-        <w:tblW w:type="auto" w:w="0"/>
-        <w:tblLook w:firstColumn="1" w:firstRow="1" w:lastColumn="0" w:lastRow="0" w:noHBand="0" w:noVBand="1" w:val="04A0"/>
-      </w:tblPr>
-      <w:tblGrid>
-        <w:gridCol w:w="4703"/>
-        <w:gridCol w:w="4703"/>
-      </w:tblGrid>
-      <w:tr>
-        <w:tc>
-          <w:tcPr>
-            <w:tcW w:type="dxa" w:w="4703"/>
-            <w:shd w:val="clear" w:color="auto" w:fill="E67E22"/>
-          </w:tcPr>
-          <w:p>
-            <w:r>
-              <w:rPr>
-                <w:b/>
-                <w:color w:val="FFFFFF"/>
-              </w:rPr>
-              <w:t>Function</w:t>
-            </w:r>
-          </w:p>
-        </w:tc>
-        <w:tc>
-          <w:tcPr>
-            <w:tcW w:type="dxa" w:w="4703"/>
-            <w:shd w:val="clear" w:color="auto" w:fill="E67E22"/>
-          </w:tcPr>
-          <w:p>
-            <w:r>
-              <w:rPr>
-                <w:b/>
-                <w:color w:val="FFFFFF"/>
-              </w:rPr>
-              <w:t>Why Emulator Needed</w:t>
-            </w:r>
-          </w:p>
-        </w:tc>
-      </w:tr>
-      <w:tr>
-        <w:tc>
-          <w:tcPr>
-            <w:tcW w:type="dxa" w:w="4703"/>
-            <w:shd w:val="clear" w:color="auto" w:fill="FFFFFF"/>
-          </w:tcPr>
-          <w:p>
-            <w:r>
-              <w:t>getAllRecipes()</w:t>
-            </w:r>
-          </w:p>
-        </w:tc>
-        <w:tc>
-          <w:tcPr>
-            <w:tcW w:type="dxa" w:w="4703"/>
-            <w:shd w:val="clear" w:color="auto" w:fill="FFFFFF"/>
-          </w:tcPr>
-          <w:p>
-            <w:r>
-              <w:t>getDocs() requires live Firestore connection</w:t>
-            </w:r>
-          </w:p>
-        </w:tc>
-      </w:tr>
-      <w:tr>
-        <w:tc>
-          <w:tcPr>
-            <w:tcW w:type="dxa" w:w="4703"/>
-            <w:shd w:val="clear" w:color="auto" w:fill="FEF9E7"/>
-          </w:tcPr>
-          <w:p>
-            <w:r>
-              <w:t>createRecipe()</w:t>
-            </w:r>
-          </w:p>
-        </w:tc>
-        <w:tc>
-          <w:tcPr>
-            <w:tcW w:type="dxa" w:w="4703"/>
-            <w:shd w:val="clear" w:color="auto" w:fill="FEF9E7"/>
-          </w:tcPr>
-          <w:p>
-            <w:r>
-              <w:t>addDoc() requires Firestore</w:t>
-            </w:r>
-          </w:p>
-        </w:tc>
-      </w:tr>
-      <w:tr>
-        <w:tc>
-          <w:tcPr>
-            <w:tcW w:type="dxa" w:w="4703"/>
-            <w:shd w:val="clear" w:color="auto" w:fill="FFFFFF"/>
-          </w:tcPr>
-          <w:p>
-            <w:r>
-              <w:t>likeRecipe()</w:t>
-            </w:r>
-          </w:p>
-        </w:tc>
-        <w:tc>
-          <w:tcPr>
-            <w:tcW w:type="dxa" w:w="4703"/>
-            <w:shd w:val="clear" w:color="auto" w:fill="FFFFFF"/>
-          </w:tcPr>
-          <w:p>
-            <w:r>
-              <w:t>setDoc() on users/{uid}/swipes/{recipeId}</w:t>
-            </w:r>
-          </w:p>
-        </w:tc>
-      </w:tr>
-      <w:tr>
-        <w:tc>
-          <w:tcPr>
-            <w:tcW w:type="dxa" w:w="4703"/>
-            <w:shd w:val="clear" w:color="auto" w:fill="FEF9E7"/>
-          </w:tcPr>
-          <w:p>
-            <w:r>
-              <w:t>unlikeRecipe()</w:t>
-            </w:r>
-          </w:p>
-        </w:tc>
-        <w:tc>
-          <w:tcPr>
-            <w:tcW w:type="dxa" w:w="4703"/>
-            <w:shd w:val="clear" w:color="auto" w:fill="FEF9E7"/>
-          </w:tcPr>
-          <w:p>
-            <w:r>
-              <w:t>deleteDoc() on swipe document</w:t>
-            </w:r>
-          </w:p>
-        </w:tc>
-      </w:tr>
-      <w:tr>
-        <w:tc>
-          <w:tcPr>
-            <w:tcW w:type="dxa" w:w="4703"/>
-            <w:shd w:val="clear" w:color="auto" w:fill="FFFFFF"/>
-          </w:tcPr>
-          <w:p>
-            <w:r>
-              <w:t>getLikedRecipeIds()</w:t>
-            </w:r>
-          </w:p>
-        </w:tc>
-        <w:tc>
-          <w:tcPr>
-            <w:tcW w:type="dxa" w:w="4703"/>
-            <w:shd w:val="clear" w:color="auto" w:fill="FFFFFF"/>
-          </w:tcPr>
-          <w:p>
-            <w:r>
-              <w:t>Firestore query on swipes subcollection</w:t>
-            </w:r>
-          </w:p>
-        </w:tc>
-      </w:tr>
-      <w:tr>
-        <w:tc>
-          <w:tcPr>
-            <w:tcW w:type="dxa" w:w="4703"/>
-            <w:shd w:val="clear" w:color="auto" w:fill="FEF9E7"/>
-          </w:tcPr>
-          <w:p>
-            <w:r>
-              <w:t>requireAuth()</w:t>
-            </w:r>
-          </w:p>
-        </w:tc>
-        <w:tc>
-          <w:tcPr>
-            <w:tcW w:type="dxa" w:w="4703"/>
-            <w:shd w:val="clear" w:color="auto" w:fill="FEF9E7"/>
-          </w:tcPr>
-          <w:p>
-            <w:r>
-              <w:t>Firebase Auth onAuthStateChanged</w:t>
-            </w:r>
-          </w:p>
-        </w:tc>
-      </w:tr>
-      <w:tr>
-        <w:tc>
-          <w:tcPr>
-            <w:tcW w:type="dxa" w:w="4703"/>
-            <w:shd w:val="clear" w:color="auto" w:fill="FFFFFF"/>
-          </w:tcPr>
-          <w:p>
-            <w:r>
-              <w:t>seedRecipesIfEmpty()</w:t>
-            </w:r>
-          </w:p>
-        </w:tc>
-        <w:tc>
-          <w:tcPr>
-            <w:tcW w:type="dxa" w:w="4703"/>
-            <w:shd w:val="clear" w:color="auto" w:fill="FFFFFF"/>
-          </w:tcPr>
-          <w:p>
-            <w:r>
-              <w:t>Reads + writes to Firestore recipes collection</w:t>
-            </w:r>
-          </w:p>
-        </w:tc>
-      </w:tr>
-    </w:tbl>
-    <w:p/>
-    <w:p>
-      <w:pPr>
-        <w:pStyle w:val="Heading2"/>
-      </w:pPr>
-      <w:r>
-        <w:rPr>
-          <w:color w:val="8E44AD"/>
-        </w:rPr>
-        <w:t>Requires Playwright / Cypress (Browser)</w:t>
-      </w:r>
-    </w:p>
-    <w:p>
-      <w:pPr>
-        <w:pStyle w:val="ListBullet"/>
-      </w:pPr>
-      <w:r>
-        <w:rPr>
-          <w:sz w:val="22"/>
-        </w:rPr>
-        <w:t>Typing in #searchInput updates the grid in real time (DOM input event)</w:t>
-      </w:r>
-    </w:p>
-    <w:p>
-      <w:pPr>
-        <w:pStyle w:val="ListBullet"/>
-      </w:pPr>
-      <w:r>
-        <w:rPr>
-          <w:sz w:val="22"/>
-        </w:rPr>
-        <w:t>Clicking a cuisine chip filters the grid (click → activeCuisine → filterAndRender)</w:t>
-      </w:r>
-    </w:p>
-    <w:p>
-      <w:pPr>
-        <w:pStyle w:val="ListBullet"/>
-      </w:pPr>
-      <w:r>
-        <w:rPr>
-          <w:sz w:val="22"/>
-        </w:rPr>
-        <w:t>Selecting difficulty in dropdown updates the grid (change event)</w:t>
-      </w:r>
-    </w:p>
-    <w:p>
-      <w:pPr>
-        <w:pStyle w:val="ListBullet"/>
-      </w:pPr>
-      <w:r>
-        <w:rPr>
-          <w:sz w:val="22"/>
-        </w:rPr>
-        <w:t>Clicking a recipe card opens the detail modal (click → DOM append)</w:t>
-      </w:r>
-    </w:p>
-    <w:p>
-      <w:pPr>
-        <w:pStyle w:val="ListBullet"/>
-      </w:pPr>
-      <w:r>
-        <w:rPr>
-          <w:sz w:val="22"/>
-        </w:rPr>
-        <w:t>Modal closes on Escape key or × button (keydown / click events)</w:t>
-      </w:r>
-    </w:p>
-    <w:p>
-      <w:pPr>
-        <w:pStyle w:val="ListBullet"/>
-      </w:pPr>
-      <w:r>
-        <w:rPr>
-          <w:sz w:val="22"/>
-        </w:rPr>
-        <w:t>Like button toggles between ❤️ Like and 💔 Unlike (async click → Firestore → class update)</w:t>
-      </w:r>
-    </w:p>
-    <w:p>
-      <w:pPr>
-        <w:pStyle w:val="ListBullet"/>
-      </w:pPr>
-      <w:r>
-        <w:rPr>
-          <w:sz w:val="22"/>
-        </w:rPr>
-        <w:t>Create Recipe FAB opens the add recipe modal (click → openAddRecipeModal → DOM append)</w:t>
-      </w:r>
-    </w:p>
-    <w:p>
-      <w:pPr>
-        <w:pStyle w:val="ListBullet"/>
-      </w:pPr>
-      <w:r>
-        <w:rPr>
-          <w:sz w:val="22"/>
-        </w:rPr>
-        <w:t>Live preview updates as user types in recipe form (input / change events)</w:t>
-      </w:r>
-    </w:p>
-    <w:p>
-      <w:pPr>
-        <w:pStyle w:val="ListBullet"/>
-      </w:pPr>
-      <w:r>
-        <w:rPr>
-          <w:sz w:val="22"/>
-        </w:rPr>
-        <w:t>New recipe appears in grid after creation (allRecipes.push → filterAndRender)</w:t>
-      </w:r>
-    </w:p>
-    <w:p>
-      <w:pPr>
-        <w:pStyle w:val="ListBullet"/>
-      </w:pPr>
-      <w:r>
-        <w:rPr>
-          <w:sz w:val="22"/>
-        </w:rPr>
-        <w:t>Responsive grid layout at different viewport widths (CSS Grid rendering)</w:t>
+        <w:t>8. Outstanding Issues &amp; Next Steps</w:t>
       </w:r>
     </w:p>
     <w:p>
       <w:r>
-        <w:br w:type="page"/>
+        <w:t>All 4 original app issues are resolved. Remaining work:</w:t>
       </w:r>
     </w:p>
     <w:p>
-      <w:pPr>
-        <w:pStyle w:val="Heading1"/>
-      </w:pPr>
       <w:r>
-        <w:rPr>
-          <w:color w:val="2C3E50"/>
-        </w:rPr>
-        <w:t>7.  Outstanding Issues &amp; Next Steps</w:t>
+        <w:t>1. Set up Firebase Emulator Suite for integration tests (likeRecipe, addMealPlanEntry, getAllRecipes)</w:t>
       </w:r>
     </w:p>
     <w:p>
-      <w:pPr>
-        <w:pStyle w:val="Heading2"/>
-      </w:pPr>
       <w:r>
-        <w:rPr>
-          <w:color w:val="E74C3C"/>
-        </w:rPr>
-        <w:t>Issues Requiring App Changes (not test changes)</w:t>
-      </w:r>
-    </w:p>
-    <w:tbl>
-      <w:tblPr>
-        <w:tblStyle w:val="TableGrid"/>
-        <w:tblW w:type="auto" w:w="0"/>
-        <w:tblLook w:firstColumn="1" w:firstRow="1" w:lastColumn="0" w:lastRow="0" w:noHBand="0" w:noVBand="1" w:val="04A0"/>
-      </w:tblPr>
-      <w:tblGrid>
-        <w:gridCol w:w="2351"/>
-        <w:gridCol w:w="2351"/>
-        <w:gridCol w:w="2351"/>
-        <w:gridCol w:w="2351"/>
-      </w:tblGrid>
-      <w:tr>
-        <w:tc>
-          <w:tcPr>
-            <w:tcW w:type="dxa" w:w="2351"/>
-            <w:shd w:val="clear" w:color="auto" w:fill="E74C3C"/>
-          </w:tcPr>
-          <w:p>
-            <w:r>
-              <w:rPr>
-                <w:b/>
-                <w:color w:val="FFFFFF"/>
-              </w:rPr>
-              <w:t>#</w:t>
-            </w:r>
-          </w:p>
-        </w:tc>
-        <w:tc>
-          <w:tcPr>
-            <w:tcW w:type="dxa" w:w="2351"/>
-            <w:shd w:val="clear" w:color="auto" w:fill="E74C3C"/>
-          </w:tcPr>
-          <w:p>
-            <w:r>
-              <w:rPr>
-                <w:b/>
-                <w:color w:val="FFFFFF"/>
-              </w:rPr>
-              <w:t>Issue</w:t>
-            </w:r>
-          </w:p>
-        </w:tc>
-        <w:tc>
-          <w:tcPr>
-            <w:tcW w:type="dxa" w:w="2351"/>
-            <w:shd w:val="clear" w:color="auto" w:fill="E74C3C"/>
-          </w:tcPr>
-          <w:p>
-            <w:r>
-              <w:rPr>
-                <w:b/>
-                <w:color w:val="FFFFFF"/>
-              </w:rPr>
-              <w:t>FR</w:t>
-            </w:r>
-          </w:p>
-        </w:tc>
-        <w:tc>
-          <w:tcPr>
-            <w:tcW w:type="dxa" w:w="2351"/>
-            <w:shd w:val="clear" w:color="auto" w:fill="E74C3C"/>
-          </w:tcPr>
-          <w:p>
-            <w:r>
-              <w:rPr>
-                <w:b/>
-                <w:color w:val="FFFFFF"/>
-              </w:rPr>
-              <w:t>Severity</w:t>
-            </w:r>
-          </w:p>
-        </w:tc>
-      </w:tr>
-      <w:tr>
-        <w:tc>
-          <w:tcPr>
-            <w:tcW w:type="dxa" w:w="2351"/>
-            <w:shd w:val="clear" w:color="auto" w:fill="FDEDEC"/>
-          </w:tcPr>
-          <w:p>
-            <w:r>
-              <w:t>1</w:t>
-            </w:r>
-          </w:p>
-        </w:tc>
-        <w:tc>
-          <w:tcPr>
-            <w:tcW w:type="dxa" w:w="2351"/>
-            <w:shd w:val="clear" w:color="auto" w:fill="FDEDEC"/>
-          </w:tcPr>
-          <w:p>
-            <w:r>
-              <w:t>Dietary filter chips not wired in discover.js</w:t>
-            </w:r>
-          </w:p>
-        </w:tc>
-        <w:tc>
-          <w:tcPr>
-            <w:tcW w:type="dxa" w:w="2351"/>
-            <w:shd w:val="clear" w:color="auto" w:fill="FDEDEC"/>
-          </w:tcPr>
-          <w:p>
-            <w:r>
-              <w:t>FR-36</w:t>
-            </w:r>
-          </w:p>
-        </w:tc>
-        <w:tc>
-          <w:tcPr>
-            <w:tcW w:type="dxa" w:w="2351"/>
-            <w:shd w:val="clear" w:color="auto" w:fill="FDEDEC"/>
-          </w:tcPr>
-          <w:p>
-            <w:r>
-              <w:t>Medium</w:t>
-            </w:r>
-          </w:p>
-        </w:tc>
-      </w:tr>
-      <w:tr>
-        <w:tc>
-          <w:tcPr>
-            <w:tcW w:type="dxa" w:w="2351"/>
-            <w:shd w:val="clear" w:color="auto" w:fill="FFFFFF"/>
-          </w:tcPr>
-          <w:p>
-            <w:r>
-              <w:t>"2</w:t>
-            </w:r>
-          </w:p>
-        </w:tc>
-        <w:tc>
-          <w:tcPr>
-            <w:tcW w:type="dxa" w:w="2351"/>
-            <w:shd w:val="clear" w:color="auto" w:fill="FFFFFF"/>
-          </w:tcPr>
-          <w:p>
-            <w:r>
-              <w:t>"Add to Plan" button missing from recipe cards</w:t>
-            </w:r>
-          </w:p>
-        </w:tc>
-        <w:tc>
-          <w:tcPr>
-            <w:tcW w:type="dxa" w:w="2351"/>
-            <w:shd w:val="clear" w:color="auto" w:fill="FFFFFF"/>
-          </w:tcPr>
-          <w:p>
-            <w:r>
-              <w:t>FR-39</w:t>
-            </w:r>
-          </w:p>
-        </w:tc>
-        <w:tc>
-          <w:tcPr>
-            <w:tcW w:type="dxa" w:w="2351"/>
-            <w:shd w:val="clear" w:color="auto" w:fill="FFFFFF"/>
-          </w:tcPr>
-          <w:p>
-            <w:r>
-              <w:t>Medium</w:t>
-            </w:r>
-          </w:p>
-        </w:tc>
-      </w:tr>
-      <w:tr>
-        <w:tc>
-          <w:tcPr>
-            <w:tcW w:type="dxa" w:w="2351"/>
-            <w:shd w:val="clear" w:color="auto" w:fill="FDEDEC"/>
-          </w:tcPr>
-          <w:p>
-            <w:r>
-              <w:t>3</w:t>
-            </w:r>
-          </w:p>
-        </w:tc>
-        <w:tc>
-          <w:tcPr>
-            <w:tcW w:type="dxa" w:w="2351"/>
-            <w:shd w:val="clear" w:color="auto" w:fill="FDEDEC"/>
-          </w:tcPr>
-          <w:p>
-            <w:r>
-              <w:t>No total like count field on recipe documents</w:t>
-            </w:r>
-          </w:p>
-        </w:tc>
-        <w:tc>
-          <w:tcPr>
-            <w:tcW w:type="dxa" w:w="2351"/>
-            <w:shd w:val="clear" w:color="auto" w:fill="FDEDEC"/>
-          </w:tcPr>
-          <w:p>
-            <w:r>
-              <w:t>FR-32</w:t>
-            </w:r>
-          </w:p>
-        </w:tc>
-        <w:tc>
-          <w:tcPr>
-            <w:tcW w:type="dxa" w:w="2351"/>
-            <w:shd w:val="clear" w:color="auto" w:fill="FDEDEC"/>
-          </w:tcPr>
-          <w:p>
-            <w:r>
-              <w:t>Low</w:t>
-            </w:r>
-          </w:p>
-        </w:tc>
-      </w:tr>
-      <w:tr>
-        <w:tc>
-          <w:tcPr>
-            <w:tcW w:type="dxa" w:w="2351"/>
-            <w:shd w:val="clear" w:color="auto" w:fill="FFFFFF"/>
-          </w:tcPr>
-          <w:p>
-            <w:r>
-              <w:t>4</w:t>
-            </w:r>
-          </w:p>
-        </w:tc>
-        <w:tc>
-          <w:tcPr>
-            <w:tcW w:type="dxa" w:w="2351"/>
-            <w:shd w:val="clear" w:color="auto" w:fill="FFFFFF"/>
-          </w:tcPr>
-          <w:p>
-            <w:r>
-              <w:t>Difficulty UI uses dropdown, not chips</w:t>
-            </w:r>
-          </w:p>
-        </w:tc>
-        <w:tc>
-          <w:tcPr>
-            <w:tcW w:type="dxa" w:w="2351"/>
-            <w:shd w:val="clear" w:color="auto" w:fill="FFFFFF"/>
-          </w:tcPr>
-          <w:p>
-            <w:r>
-              <w:t>FR-35</w:t>
-            </w:r>
-          </w:p>
-        </w:tc>
-        <w:tc>
-          <w:tcPr>
-            <w:tcW w:type="dxa" w:w="2351"/>
-            <w:shd w:val="clear" w:color="auto" w:fill="FFFFFF"/>
-          </w:tcPr>
-          <w:p>
-            <w:r>
-              <w:t>Low</w:t>
-            </w:r>
-          </w:p>
-        </w:tc>
-      </w:tr>
-    </w:tbl>
-    <w:p/>
-    <w:p>
-      <w:pPr>
-        <w:pStyle w:val="Heading2"/>
-      </w:pPr>
-      <w:r>
-        <w:rPr>
-          <w:color w:val="27AE60"/>
-        </w:rPr>
-        <w:t>Recommended Next Steps (in order)</w:t>
+        <w:t>2. Verify likeCount increments correctly in Firestore via emulator</w:t>
       </w:r>
     </w:p>
     <w:p>
-      <w:pPr>
-        <w:pStyle w:val="ListNumber"/>
-      </w:pPr>
       <w:r>
-        <w:rPr>
-          <w:sz w:val="22"/>
-        </w:rPr>
-        <w:t>1.  Wire dietary filter into filterAndRender() in discover.js and add dietary chip buttons to discover.html</w:t>
+        <w:t>3. Verify mealplan entries appear in users/{uid}/mealplan/ after Add to Plan</w:t>
       </w:r>
     </w:p>
     <w:p>
-      <w:pPr>
-        <w:pStyle w:val="ListNumber"/>
-      </w:pPr>
       <w:r>
-        <w:rPr>
-          <w:sz w:val="22"/>
-        </w:rPr>
-        <w:t>2.  Add "Add to Plan" button to each recipe card in renderGrid(), implement the day/meal picker UI, and save to Firestore</w:t>
+        <w:t>4. Set up Playwright for e2e browser tests (chips, modal, live count)</w:t>
       </w:r>
     </w:p>
     <w:p>
-      <w:pPr>
-        <w:pStyle w:val="ListNumber"/>
-      </w:pPr>
       <w:r>
-        <w:rPr>
-          <w:sz w:val="22"/>
-        </w:rPr>
-        <w:t>3.  Decide on like count strategy — denormalized likeCount field on recipe documents, or Firestore count() aggregation</w:t>
-      </w:r>
-    </w:p>
-    <w:p>
-      <w:pPr>
-        <w:pStyle w:val="ListNumber"/>
-      </w:pPr>
-      <w:r>
-        <w:rPr>
-          <w:sz w:val="22"/>
-        </w:rPr>
-        <w:t>4.  Set up Firebase Emulator Suite to enable integration tests for all Firestore read/write operations</w:t>
-      </w:r>
-    </w:p>
-    <w:p>
-      <w:pPr>
-        <w:pStyle w:val="ListNumber"/>
-      </w:pPr>
-      <w:r>
-        <w:rPr>
-          <w:sz w:val="22"/>
-        </w:rPr>
-        <w:t>5.  Set up Playwright for e2e tests covering DOM interactions, real-time filtering, modal open/close, and full like flow</w:t>
+        <w:t>5. Story 3: meal plan page reads Firestore mealplan subcollection and renders weekly grid</w:t>
       </w:r>
     </w:p>
     <w:p/>
-    <w:p>
-      <w:r>
-        <w:rPr>
-          <w:color w:val="CCCCCC"/>
-          <w:sz w:val="16"/>
-        </w:rPr>
-        <w:t>────────────────────────────────────────────────────────────────────────────────</w:t>
-      </w:r>
-    </w:p>
     <w:p>
       <w:pPr>
         <w:jc w:val="center"/>
       </w:pPr>
       <w:r>
         <w:rPr>
-          <w:i/>
-          <w:color w:val="999999"/>
-          <w:sz w:val="18"/>
+          <w:color w:val="888888"/>
         </w:rPr>
-        <w:t>Report generated: 2026-03-09  |  Vitest v1.6.1  |  Tender Firebase App — Story 2</w:t>
+        <w:t>Report generated: 2026-03-09 | Vitest v1.6.1 | Tender Firebase App — Story 2</w:t>
       </w:r>
     </w:p>
     <w:sectPr>
       <w:pgSz w:w="12240" w:h="15840"/>
-      <w:pgMar w:top="1134" w:right="1417" w:bottom="1134" w:left="1417" w:header="720" w:footer="720" w:gutter="0"/>
+      <w:pgMar w:top="1440" w:right="1800" w:bottom="1440" w:left="1800" w:header="720" w:footer="720" w:gutter="0"/>
       <w:cols w:space="720"/>
       <w:docGrid w:linePitch="360"/>
     </w:sectPr>

</xml_diff>